<commit_message>
Document acceptance criteria for all six team roles
</commit_message>
<xml_diff>
--- a/TeamFS六人分工.docx
+++ b/TeamFS六人分工.docx
@@ -6,11 +6,20 @@
       <w:pPr>
         <w:pStyle w:val="Title"/>
         <w:keepNext/>
-        <w:spacing w:after="260"/>
+        <w:spacing w:after="180"/>
         <w:jc w:val="center"/>
       </w:pPr>
       <w:r>
-        <w:t>TeamFS 小组分工</w:t>
+        <w:t>TeamFS 小组分工与验收标准</w:t>
+      </w:r>
+    </w:p>
+    <w:p>
+      <w:pPr>
+        <w:keepNext/>
+        <w:spacing w:after="200" w:line="276" w:lineRule="auto"/>
+      </w:pPr>
+      <w:r>
+        <w:t>每位成员按本人验收项复测并提交凭证。实验使用独立临时挂载点和存储，记录运行环境、提交号及实际结果。</w:t>
       </w:r>
     </w:p>
     <w:tbl>
@@ -169,7 +178,7 @@
           </w:tcPr>
           <w:p>
             <w:pPr>
-              <w:keepNext w:val="0"/>
+              <w:keepNext/>
               <w:widowControl w:val="0"/>
               <w:spacing w:before="0" w:after="0"/>
               <w:jc w:val="center"/>
@@ -196,7 +205,7 @@
           </w:tcPr>
           <w:p>
             <w:pPr>
-              <w:keepNext w:val="0"/>
+              <w:keepNext/>
               <w:widowControl w:val="0"/>
               <w:spacing w:before="0" w:after="0"/>
               <w:jc w:val="left"/>
@@ -223,7 +232,7 @@
           </w:tcPr>
           <w:p>
             <w:pPr>
-              <w:keepNext w:val="0"/>
+              <w:keepNext/>
               <w:widowControl w:val="0"/>
               <w:spacing w:before="0" w:after="0"/>
               <w:jc w:val="left"/>
@@ -250,7 +259,7 @@
           </w:tcPr>
           <w:p>
             <w:pPr>
-              <w:keepNext w:val="0"/>
+              <w:keepNext/>
               <w:widowControl w:val="0"/>
               <w:spacing w:before="0" w:after="0"/>
               <w:jc w:val="left"/>
@@ -274,6 +283,103 @@
             <w:tcW w:type="dxa" w:w="893"/>
             <w:vAlign w:val="center"/>
             <w:tcMar>
+              <w:top w:w="110" w:type="dxa"/>
+              <w:bottom w:w="110" w:type="dxa"/>
+              <w:left w:w="105" w:type="dxa"/>
+              <w:right w:w="105" w:type="dxa"/>
+            </w:tcMar>
+          </w:tcPr>
+          <w:p>
+            <w:pPr>
+              <w:jc w:val="center"/>
+            </w:pPr>
+            <w:r>
+              <w:rPr>
+                <w:b/>
+              </w:rPr>
+              <w:t>验收</w:t>
+              <w:br/>
+              <w:t>标准</w:t>
+            </w:r>
+          </w:p>
+        </w:tc>
+        <w:tc>
+          <w:tcPr>
+            <w:tcW w:type="dxa" w:w="9476"/>
+            <w:gridSpan w:val="3"/>
+            <w:vAlign w:val="center"/>
+            <w:tcMar>
+              <w:top w:w="110" w:type="dxa"/>
+              <w:bottom w:w="110" w:type="dxa"/>
+              <w:left w:w="105" w:type="dxa"/>
+              <w:right w:w="105" w:type="dxa"/>
+            </w:tcMar>
+          </w:tcPr>
+          <w:p>
+            <w:pPr>
+              <w:spacing w:after="60" w:line="264" w:lineRule="auto"/>
+            </w:pPr>
+            <w:r>
+              <w:t>1. 换机复现：由另一名成员按 README 克隆、构建、挂载、读写、同步并卸载成功；不依赖组长电脑上的额外文件。</w:t>
+            </w:r>
+          </w:p>
+          <w:p>
+            <w:pPr>
+              <w:spacing w:after="60" w:line="264" w:lineRule="auto"/>
+            </w:pPr>
+            <w:r>
+              <w:t>2. 集成检查：运行 scripts/check.sh，退出码为 0，报告无 fail；不支持和环境跳过须单独列明，未执行的测试不能算通过。</w:t>
+            </w:r>
+          </w:p>
+          <w:p>
+            <w:pPr>
+              <w:spacing w:after="60" w:line="264" w:lineRule="auto"/>
+            </w:pPr>
+            <w:r>
+              <w:t>3. 完整演示：连续完成写报告、同步重挂载、快照、修改与恢复、误删与回收恢复、查看监控；恢复内容与原稿一致。</w:t>
+            </w:r>
+          </w:p>
+          <w:p>
+            <w:pPr>
+              <w:spacing w:after="60" w:line="264" w:lineRule="auto"/>
+            </w:pPr>
+            <w:r>
+              <w:t>4. 原理讲解：分别追踪一次读取和写入，能说明应用、VFS、FUSE、Rust 回调及存储的关系，并定位对应代码。</w:t>
+            </w:r>
+          </w:p>
+          <w:p>
+            <w:pPr>
+              <w:spacing w:after="60" w:line="264" w:lineRule="auto"/>
+            </w:pPr>
+            <w:r>
+              <w:t>5. 发布核对：GitHub 目标分支的提交号与验收版本一致；保存 CI 结果。云端未运行挂载测试时，须注明并附本地真实挂载结果。</w:t>
+            </w:r>
+          </w:p>
+          <w:p>
+            <w:pPr>
+              <w:spacing w:after="0" w:line="264" w:lineRule="auto"/>
+            </w:pPr>
+            <w:r>
+              <w:rPr>
+                <w:b/>
+              </w:rPr>
+              <w:t>验收凭证：</w:t>
+            </w:r>
+            <w:r>
+              <w:t>环境与提交号、换机操作记录、完整验收输出、演示录屏、架构图、GitHub 与 CI 链接。</w:t>
+            </w:r>
+          </w:p>
+        </w:tc>
+      </w:tr>
+      <w:tr>
+        <w:trPr>
+          <w:cantSplit/>
+        </w:trPr>
+        <w:tc>
+          <w:tcPr>
+            <w:tcW w:type="dxa" w:w="893"/>
+            <w:vAlign w:val="center"/>
+            <w:tcMar>
               <w:top w:w="115" w:type="dxa"/>
               <w:bottom w:w="115" w:type="dxa"/>
               <w:left w:w="105" w:type="dxa"/>
@@ -282,7 +388,7 @@
           </w:tcPr>
           <w:p>
             <w:pPr>
-              <w:keepNext w:val="0"/>
+              <w:keepNext/>
               <w:widowControl w:val="0"/>
               <w:spacing w:before="0" w:after="0"/>
               <w:jc w:val="center"/>
@@ -309,7 +415,7 @@
           </w:tcPr>
           <w:p>
             <w:pPr>
-              <w:keepNext w:val="0"/>
+              <w:keepNext/>
               <w:widowControl w:val="0"/>
               <w:spacing w:before="0" w:after="0"/>
               <w:jc w:val="left"/>
@@ -336,7 +442,7 @@
           </w:tcPr>
           <w:p>
             <w:pPr>
-              <w:keepNext w:val="0"/>
+              <w:keepNext/>
               <w:widowControl w:val="0"/>
               <w:spacing w:before="0" w:after="0"/>
               <w:jc w:val="left"/>
@@ -363,7 +469,7 @@
           </w:tcPr>
           <w:p>
             <w:pPr>
-              <w:keepNext w:val="0"/>
+              <w:keepNext/>
               <w:widowControl w:val="0"/>
               <w:spacing w:before="0" w:after="0"/>
               <w:jc w:val="left"/>
@@ -387,6 +493,103 @@
             <w:tcW w:type="dxa" w:w="893"/>
             <w:vAlign w:val="center"/>
             <w:tcMar>
+              <w:top w:w="110" w:type="dxa"/>
+              <w:bottom w:w="110" w:type="dxa"/>
+              <w:left w:w="105" w:type="dxa"/>
+              <w:right w:w="105" w:type="dxa"/>
+            </w:tcMar>
+          </w:tcPr>
+          <w:p>
+            <w:pPr>
+              <w:jc w:val="center"/>
+            </w:pPr>
+            <w:r>
+              <w:rPr>
+                <w:b/>
+              </w:rPr>
+              <w:t>验收</w:t>
+              <w:br/>
+              <w:t>标准</w:t>
+            </w:r>
+          </w:p>
+        </w:tc>
+        <w:tc>
+          <w:tcPr>
+            <w:tcW w:type="dxa" w:w="9476"/>
+            <w:gridSpan w:val="3"/>
+            <w:vAlign w:val="center"/>
+            <w:tcMar>
+              <w:top w:w="110" w:type="dxa"/>
+              <w:bottom w:w="110" w:type="dxa"/>
+              <w:left w:w="105" w:type="dxa"/>
+              <w:right w:w="105" w:type="dxa"/>
+            </w:tcMar>
+          </w:tcPr>
+          <w:p>
+            <w:pPr>
+              <w:spacing w:after="60" w:line="264" w:lineRule="auto"/>
+            </w:pPr>
+            <w:r>
+              <w:t>1. 基础操作：中文名、非 UTF-8 名称、二进制与空文件的创建和读写正确；偏移写、追加、截断、改名与目录操作结果符合预期。</w:t>
+            </w:r>
+          </w:p>
+          <w:p>
+            <w:pPr>
+              <w:spacing w:after="60" w:line="264" w:lineRule="auto"/>
+            </w:pPr>
+            <w:r>
+              <w:t>2. 句柄与并发：删除或被改名覆盖的文件，其已有句柄仍可读写；并发追加记录无缺失，原子替换期间读取不到半个新文件或短暂缺失的目标。</w:t>
+            </w:r>
+          </w:p>
+          <w:p>
+            <w:pPr>
+              <w:spacing w:after="60" w:line="264" w:lineRule="auto"/>
+            </w:pPr>
+            <w:r>
+              <w:t>3. 软件兼容：在 direct 与 cached 模式运行 Git、Vim、rsync 和文件锁场景；支持项无失败，不支持项及 SQLite 保存边界注明原因。</w:t>
+            </w:r>
+          </w:p>
+          <w:p>
+            <w:pPr>
+              <w:spacing w:after="60" w:line="264" w:lineRule="auto"/>
+            </w:pPr>
+            <w:r>
+              <w:t>4. 随机对照：两种模式各跑 3 个固定种子，每组 180 次操作；内容、路径和错误结果与原生目录对照一致，重挂载恢复到正确保存点。</w:t>
+            </w:r>
+          </w:p>
+          <w:p>
+            <w:pPr>
+              <w:spacing w:after="60" w:line="264" w:lineRule="auto"/>
+            </w:pPr>
+            <w:r>
+              <w:t>5. 错误处理：目标已存在、目录非空、无权限、类型冲突及非法路径返回相应错误；失败操作不破坏原文件，不留下半成品。</w:t>
+            </w:r>
+          </w:p>
+          <w:p>
+            <w:pPr>
+              <w:spacing w:after="0" w:line="264" w:lineRule="auto"/>
+            </w:pPr>
+            <w:r>
+              <w:rPr>
+                <w:b/>
+              </w:rPr>
+              <w:t>验收凭证：</w:t>
+            </w:r>
+            <w:r>
+              <w:t>基础操作日志、兼容性 JSON、随机种子和操作序列、问题修复前后对比及复测记录。</w:t>
+            </w:r>
+          </w:p>
+        </w:tc>
+      </w:tr>
+      <w:tr>
+        <w:trPr>
+          <w:cantSplit/>
+        </w:trPr>
+        <w:tc>
+          <w:tcPr>
+            <w:tcW w:type="dxa" w:w="893"/>
+            <w:vAlign w:val="center"/>
+            <w:tcMar>
               <w:top w:w="115" w:type="dxa"/>
               <w:bottom w:w="115" w:type="dxa"/>
               <w:left w:w="105" w:type="dxa"/>
@@ -395,7 +598,7 @@
           </w:tcPr>
           <w:p>
             <w:pPr>
-              <w:keepNext w:val="0"/>
+              <w:keepNext/>
               <w:widowControl w:val="0"/>
               <w:spacing w:before="0" w:after="0"/>
               <w:jc w:val="center"/>
@@ -422,7 +625,7 @@
           </w:tcPr>
           <w:p>
             <w:pPr>
-              <w:keepNext w:val="0"/>
+              <w:keepNext/>
               <w:widowControl w:val="0"/>
               <w:spacing w:before="0" w:after="0"/>
               <w:jc w:val="left"/>
@@ -449,7 +652,7 @@
           </w:tcPr>
           <w:p>
             <w:pPr>
-              <w:keepNext w:val="0"/>
+              <w:keepNext/>
               <w:widowControl w:val="0"/>
               <w:spacing w:before="0" w:after="0"/>
               <w:jc w:val="left"/>
@@ -476,7 +679,7 @@
           </w:tcPr>
           <w:p>
             <w:pPr>
-              <w:keepNext w:val="0"/>
+              <w:keepNext/>
               <w:widowControl w:val="0"/>
               <w:spacing w:before="0" w:after="0"/>
               <w:jc w:val="left"/>
@@ -500,6 +703,111 @@
             <w:tcW w:type="dxa" w:w="893"/>
             <w:vAlign w:val="center"/>
             <w:tcMar>
+              <w:top w:w="110" w:type="dxa"/>
+              <w:bottom w:w="110" w:type="dxa"/>
+              <w:left w:w="105" w:type="dxa"/>
+              <w:right w:w="105" w:type="dxa"/>
+            </w:tcMar>
+          </w:tcPr>
+          <w:p>
+            <w:pPr>
+              <w:jc w:val="center"/>
+            </w:pPr>
+            <w:r>
+              <w:rPr>
+                <w:b/>
+              </w:rPr>
+              <w:t>验收</w:t>
+              <w:br/>
+              <w:t>标准</w:t>
+            </w:r>
+          </w:p>
+        </w:tc>
+        <w:tc>
+          <w:tcPr>
+            <w:tcW w:type="dxa" w:w="9476"/>
+            <w:gridSpan w:val="3"/>
+            <w:vAlign w:val="center"/>
+            <w:tcMar>
+              <w:top w:w="110" w:type="dxa"/>
+              <w:bottom w:w="110" w:type="dxa"/>
+              <w:left w:w="105" w:type="dxa"/>
+              <w:right w:w="105" w:type="dxa"/>
+            </w:tcMar>
+          </w:tcPr>
+          <w:p>
+            <w:pPr>
+              <w:spacing w:after="60" w:line="264" w:lineRule="auto"/>
+            </w:pPr>
+            <w:r>
+              <w:t>1. 保存边界：先同步 A 再写入未同步 B，强制结束后恢复 A；同步 B 后强制结束恢复 B；正常卸载后的修改可在重挂载后读取。</w:t>
+            </w:r>
+          </w:p>
+          <w:p>
+            <w:pPr>
+              <w:spacing w:after="60" w:line="264" w:lineRule="auto"/>
+            </w:pPr>
+            <w:r>
+              <w:t>2. 自动同步：开启后停止业务请求，未同步修改仍能保存；关闭时不自动提交。同步失败保留 dirty 与错误信息，修复后可重试成功。</w:t>
+            </w:r>
+          </w:p>
+          <w:p>
+            <w:pPr>
+              <w:spacing w:after="60" w:line="264" w:lineRule="auto"/>
+            </w:pPr>
+            <w:r>
+              <w:t>3. 事务失败：对 blobs、nodes、metadata 注入失败，并组合同步、创建快照、清理回收站共 9 组；旧提交完整，失败结果不对外生效。</w:t>
+            </w:r>
+          </w:p>
+          <w:p>
+            <w:pPr>
+              <w:spacing w:after="60" w:line="264" w:lineRule="auto"/>
+            </w:pPr>
+            <w:r>
+              <w:t>4. 存储占用：短暂写锁释放后同步成功；超过等待时间则明确失败并保留修改，解除占用后重试能保存。</w:t>
+            </w:r>
+          </w:p>
+          <w:p>
+            <w:pPr>
+              <w:spacing w:after="60" w:line="264" w:lineRule="auto"/>
+            </w:pPr>
+            <w:r>
+              <w:t>5. 只读诊断：check 接受有效离线存储，拒绝正在使用、损坏或未知格式的存储且不重建数据；doctor 正确说明环境和挂载问题。</w:t>
+            </w:r>
+          </w:p>
+          <w:p>
+            <w:pPr>
+              <w:spacing w:after="60" w:line="264" w:lineRule="auto"/>
+            </w:pPr>
+            <w:r>
+              <w:t>6. 启动保护：同一存储的第二个挂载被拒绝，第一个挂载仍能正常使用；存储目录不能放在挂载点内。</w:t>
+            </w:r>
+          </w:p>
+          <w:p>
+            <w:pPr>
+              <w:spacing w:after="0" w:line="264" w:lineRule="auto"/>
+            </w:pPr>
+            <w:r>
+              <w:rPr>
+                <w:b/>
+              </w:rPr>
+              <w:t>验收凭证：</w:t>
+            </w:r>
+            <w:r>
+              <w:t>保存前后内容校验、9 组故障日志、错误与重试记录、诊断输出、存储结构与保存时序图。</w:t>
+            </w:r>
+          </w:p>
+        </w:tc>
+      </w:tr>
+      <w:tr>
+        <w:trPr>
+          <w:cantSplit/>
+        </w:trPr>
+        <w:tc>
+          <w:tcPr>
+            <w:tcW w:type="dxa" w:w="893"/>
+            <w:vAlign w:val="center"/>
+            <w:tcMar>
               <w:top w:w="115" w:type="dxa"/>
               <w:bottom w:w="115" w:type="dxa"/>
               <w:left w:w="105" w:type="dxa"/>
@@ -508,7 +816,7 @@
           </w:tcPr>
           <w:p>
             <w:pPr>
-              <w:keepNext w:val="0"/>
+              <w:keepNext/>
               <w:widowControl w:val="0"/>
               <w:spacing w:before="0" w:after="0"/>
               <w:jc w:val="center"/>
@@ -535,7 +843,7 @@
           </w:tcPr>
           <w:p>
             <w:pPr>
-              <w:keepNext w:val="0"/>
+              <w:keepNext/>
               <w:widowControl w:val="0"/>
               <w:spacing w:before="0" w:after="0"/>
               <w:jc w:val="left"/>
@@ -562,7 +870,7 @@
           </w:tcPr>
           <w:p>
             <w:pPr>
-              <w:keepNext w:val="0"/>
+              <w:keepNext/>
               <w:widowControl w:val="0"/>
               <w:spacing w:before="0" w:after="0"/>
               <w:jc w:val="left"/>
@@ -589,7 +897,7 @@
           </w:tcPr>
           <w:p>
             <w:pPr>
-              <w:keepNext w:val="0"/>
+              <w:keepNext/>
               <w:widowControl w:val="0"/>
               <w:spacing w:before="0" w:after="0"/>
               <w:jc w:val="left"/>
@@ -613,6 +921,111 @@
             <w:tcW w:type="dxa" w:w="893"/>
             <w:vAlign w:val="center"/>
             <w:tcMar>
+              <w:top w:w="110" w:type="dxa"/>
+              <w:bottom w:w="110" w:type="dxa"/>
+              <w:left w:w="105" w:type="dxa"/>
+              <w:right w:w="105" w:type="dxa"/>
+            </w:tcMar>
+          </w:tcPr>
+          <w:p>
+            <w:pPr>
+              <w:jc w:val="center"/>
+            </w:pPr>
+            <w:r>
+              <w:rPr>
+                <w:b/>
+              </w:rPr>
+              <w:t>验收</w:t>
+              <w:br/>
+              <w:t>标准</w:t>
+            </w:r>
+          </w:p>
+        </w:tc>
+        <w:tc>
+          <w:tcPr>
+            <w:tcW w:type="dxa" w:w="9476"/>
+            <w:gridSpan w:val="3"/>
+            <w:vAlign w:val="center"/>
+            <w:tcMar>
+              <w:top w:w="110" w:type="dxa"/>
+              <w:bottom w:w="110" w:type="dxa"/>
+              <w:left w:w="105" w:type="dxa"/>
+              <w:right w:w="105" w:type="dxa"/>
+            </w:tcMar>
+          </w:tcPr>
+          <w:p>
+            <w:pPr>
+              <w:spacing w:after="60" w:line="264" w:lineRule="auto"/>
+            </w:pPr>
+            <w:r>
+              <w:t>1. 历史隔离：创建快照后修改、截断、改名或删除当前文件，历史内容保持不变；对快照的写入、改名、删除和属性修改被拒绝。</w:t>
+            </w:r>
+          </w:p>
+          <w:p>
+            <w:pPr>
+              <w:spacing w:after="60" w:line="264" w:lineRule="auto"/>
+            </w:pPr>
+            <w:r>
+              <w:t>2. 恢复一致：中文名、二进制和空文件恢复后校验一致；目录恢复保持层级、权限和修改时间，软链接保持原目标字符串。</w:t>
+            </w:r>
+          </w:p>
+          <w:p>
+            <w:pPr>
+              <w:spacing w:after="60" w:line="264" w:lineRule="auto"/>
+            </w:pPr>
+            <w:r>
+              <w:t>3. 恢复边界：已有目标、缺失父目录、绝对路径、越界路径和管理目录目标均被拒绝，目标处不留下部分恢复内容。</w:t>
+            </w:r>
+          </w:p>
+          <w:p>
+            <w:pPr>
+              <w:spacing w:after="60" w:line="264" w:lineRule="auto"/>
+            </w:pPr>
+            <w:r>
+              <w:t>4. 回收与句柄：普通删除、改名覆盖产生正确记录；恢复不移除原记录。清理记录或删除快照后，已打开的历史文件仍可读到关闭。</w:t>
+            </w:r>
+          </w:p>
+          <w:p>
+            <w:pPr>
+              <w:spacing w:after="60" w:line="264" w:lineRule="auto"/>
+            </w:pPr>
+            <w:r>
+              <w:t>5. 差异正确：新增、删除、内容、属性、类型变化均正确列出；改名表现为旧路径删除和新路径新增，单纯读取不产生访问时间差异。</w:t>
+            </w:r>
+          </w:p>
+          <w:p>
+            <w:pPr>
+              <w:spacing w:after="60" w:line="264" w:lineRule="auto"/>
+            </w:pPr>
+            <w:r>
+              <w:t>6. 独立备份：备份校验成功，导入新存储后文件与历史可读；损坏备份和已有目标被拒绝，不覆盖原存储或发布半成品。</w:t>
+            </w:r>
+          </w:p>
+          <w:p>
+            <w:pPr>
+              <w:spacing w:after="0" w:line="264" w:lineRule="auto"/>
+            </w:pPr>
+            <w:r>
+              <w:rPr>
+                <w:b/>
+              </w:rPr>
+              <w:t>验收凭证：</w:t>
+            </w:r>
+            <w:r>
+              <w:t>完整恢复命令与录屏、恢复前后 SHA256、目录和属性对照、差异清单、备份校验及导入记录。</w:t>
+            </w:r>
+          </w:p>
+        </w:tc>
+      </w:tr>
+      <w:tr>
+        <w:trPr>
+          <w:cantSplit/>
+        </w:trPr>
+        <w:tc>
+          <w:tcPr>
+            <w:tcW w:type="dxa" w:w="893"/>
+            <w:vAlign w:val="center"/>
+            <w:tcMar>
               <w:top w:w="115" w:type="dxa"/>
               <w:bottom w:w="115" w:type="dxa"/>
               <w:left w:w="105" w:type="dxa"/>
@@ -621,7 +1034,7 @@
           </w:tcPr>
           <w:p>
             <w:pPr>
-              <w:keepNext w:val="0"/>
+              <w:keepNext/>
               <w:widowControl w:val="0"/>
               <w:spacing w:before="0" w:after="0"/>
               <w:jc w:val="center"/>
@@ -648,7 +1061,7 @@
           </w:tcPr>
           <w:p>
             <w:pPr>
-              <w:keepNext w:val="0"/>
+              <w:keepNext/>
               <w:widowControl w:val="0"/>
               <w:spacing w:before="0" w:after="0"/>
               <w:jc w:val="left"/>
@@ -675,7 +1088,7 @@
           </w:tcPr>
           <w:p>
             <w:pPr>
-              <w:keepNext w:val="0"/>
+              <w:keepNext/>
               <w:widowControl w:val="0"/>
               <w:spacing w:before="0" w:after="0"/>
               <w:jc w:val="left"/>
@@ -702,7 +1115,7 @@
           </w:tcPr>
           <w:p>
             <w:pPr>
-              <w:keepNext w:val="0"/>
+              <w:keepNext/>
               <w:widowControl w:val="0"/>
               <w:spacing w:before="0" w:after="0"/>
               <w:jc w:val="left"/>
@@ -726,6 +1139,103 @@
             <w:tcW w:type="dxa" w:w="893"/>
             <w:vAlign w:val="center"/>
             <w:tcMar>
+              <w:top w:w="110" w:type="dxa"/>
+              <w:bottom w:w="110" w:type="dxa"/>
+              <w:left w:w="105" w:type="dxa"/>
+              <w:right w:w="105" w:type="dxa"/>
+            </w:tcMar>
+          </w:tcPr>
+          <w:p>
+            <w:pPr>
+              <w:jc w:val="center"/>
+            </w:pPr>
+            <w:r>
+              <w:rPr>
+                <w:b/>
+              </w:rPr>
+              <w:t>验收</w:t>
+              <w:br/>
+              <w:t>标准</w:t>
+            </w:r>
+          </w:p>
+        </w:tc>
+        <w:tc>
+          <w:tcPr>
+            <w:tcW w:type="dxa" w:w="9476"/>
+            <w:gridSpan w:val="3"/>
+            <w:vAlign w:val="center"/>
+            <w:tcMar>
+              <w:top w:w="110" w:type="dxa"/>
+              <w:bottom w:w="110" w:type="dxa"/>
+              <w:left w:w="105" w:type="dxa"/>
+              <w:right w:w="105" w:type="dxa"/>
+            </w:tcMar>
+          </w:tcPr>
+          <w:p>
+            <w:pPr>
+              <w:spacing w:after="60" w:line="264" w:lineRule="auto"/>
+            </w:pPr>
+            <w:r>
+              <w:t>1. 按需读取：保存并重挂载后记录内容读取量；读取文件片段结果正确，能够用指标说明内容何时加载及缓存、未落盘内容各自的占用。</w:t>
+            </w:r>
+          </w:p>
+          <w:p>
+            <w:pPr>
+              <w:spacing w:after="60" w:line="264" w:lineRule="auto"/>
+            </w:pPr>
+            <w:r>
+              <w:t>2. 基线复现：在相同机器、数据和参数下测试原生目录、direct、cached；每项至少 3 次，保存 fio 原始 JSON、样本及中位数。</w:t>
+            </w:r>
+          </w:p>
+          <w:p>
+            <w:pPr>
+              <w:spacing w:after="60" w:line="264" w:lineRule="auto"/>
+            </w:pPr>
+            <w:r>
+              <w:t>3. 构建对照：补充 release 实验，明确实际可执行文件、编译参数和缓存条件；与 debug 对照，不混用两种构建的结果。</w:t>
+            </w:r>
+          </w:p>
+          <w:p>
+            <w:pPr>
+              <w:spacing w:after="60" w:line="264" w:lineRule="auto"/>
+            </w:pPr>
+            <w:r>
+              <w:t>4. 保存成本：分别修改 4KiB 文件和 16MiB 文件中的 4KiB，记录写入与同步耗时、SQL 内容插入量；正确解释当前整文件保存的成本。</w:t>
+            </w:r>
+          </w:p>
+          <w:p>
+            <w:pPr>
+              <w:spacing w:after="60" w:line="264" w:lineRule="auto"/>
+            </w:pPr>
+            <w:r>
+              <w:t>5. 慢请求分析：复现一次短暂存储等待，指标能定位保存阶段，解除后正常保存；区分锁等待、业务处理和其中的保存耗时，避免重复累计。</w:t>
+            </w:r>
+          </w:p>
+          <w:p>
+            <w:pPr>
+              <w:spacing w:after="0" w:line="264" w:lineRule="auto"/>
+            </w:pPr>
+            <w:r>
+              <w:rPr>
+                <w:b/>
+              </w:rPr>
+              <w:t>验收凭证：</w:t>
+            </w:r>
+            <w:r>
+              <w:t>环境、版本、构建与命令记录，原始样本、对照报告和瓶颈解释；优化建议须有测量依据，不预设必须快于原生文件系统。</w:t>
+            </w:r>
+          </w:p>
+        </w:tc>
+      </w:tr>
+      <w:tr>
+        <w:trPr>
+          <w:cantSplit/>
+        </w:trPr>
+        <w:tc>
+          <w:tcPr>
+            <w:tcW w:type="dxa" w:w="893"/>
+            <w:vAlign w:val="center"/>
+            <w:tcMar>
               <w:top w:w="115" w:type="dxa"/>
               <w:bottom w:w="115" w:type="dxa"/>
               <w:left w:w="105" w:type="dxa"/>
@@ -734,7 +1244,7 @@
           </w:tcPr>
           <w:p>
             <w:pPr>
-              <w:keepNext w:val="0"/>
+              <w:keepNext/>
               <w:widowControl w:val="0"/>
               <w:spacing w:before="0" w:after="0"/>
               <w:jc w:val="center"/>
@@ -761,7 +1271,7 @@
           </w:tcPr>
           <w:p>
             <w:pPr>
-              <w:keepNext w:val="0"/>
+              <w:keepNext/>
               <w:widowControl w:val="0"/>
               <w:spacing w:before="0" w:after="0"/>
               <w:jc w:val="left"/>
@@ -788,7 +1298,7 @@
           </w:tcPr>
           <w:p>
             <w:pPr>
-              <w:keepNext w:val="0"/>
+              <w:keepNext/>
               <w:widowControl w:val="0"/>
               <w:spacing w:before="0" w:after="0"/>
               <w:jc w:val="left"/>
@@ -815,7 +1325,7 @@
           </w:tcPr>
           <w:p>
             <w:pPr>
-              <w:keepNext w:val="0"/>
+              <w:keepNext/>
               <w:widowControl w:val="0"/>
               <w:spacing w:before="0" w:after="0"/>
               <w:jc w:val="left"/>
@@ -826,6 +1336,111 @@
                 <w:color w:val="000000"/>
               </w:rPr>
               <w:t>监控流程图、真实操作录屏、监控验收记录、统一后的展示页面。</w:t>
+            </w:r>
+          </w:p>
+        </w:tc>
+      </w:tr>
+      <w:tr>
+        <w:trPr>
+          <w:cantSplit/>
+        </w:trPr>
+        <w:tc>
+          <w:tcPr>
+            <w:tcW w:type="dxa" w:w="893"/>
+            <w:vAlign w:val="center"/>
+            <w:tcMar>
+              <w:top w:w="110" w:type="dxa"/>
+              <w:bottom w:w="110" w:type="dxa"/>
+              <w:left w:w="105" w:type="dxa"/>
+              <w:right w:w="105" w:type="dxa"/>
+            </w:tcMar>
+          </w:tcPr>
+          <w:p>
+            <w:pPr>
+              <w:jc w:val="center"/>
+            </w:pPr>
+            <w:r>
+              <w:rPr>
+                <w:b/>
+              </w:rPr>
+              <w:t>验收</w:t>
+              <w:br/>
+              <w:t>标准</w:t>
+            </w:r>
+          </w:p>
+        </w:tc>
+        <w:tc>
+          <w:tcPr>
+            <w:tcW w:type="dxa" w:w="9476"/>
+            <w:gridSpan w:val="3"/>
+            <w:vAlign w:val="center"/>
+            <w:tcMar>
+              <w:top w:w="110" w:type="dxa"/>
+              <w:bottom w:w="110" w:type="dxa"/>
+              <w:left w:w="105" w:type="dxa"/>
+              <w:right w:w="105" w:type="dxa"/>
+            </w:tcMar>
+          </w:tcPr>
+          <w:p>
+            <w:pPr>
+              <w:spacing w:after="60" w:line="264" w:lineRule="auto"/>
+            </w:pPr>
+            <w:r>
+              <w:t>1. 真实对应：在挂载点执行创建、读写、改名、删除和同步；日志中的操作、路径、PID、结果及实际字节与对应回调一致，不包含文件正文。</w:t>
+            </w:r>
+          </w:p>
+          <w:p>
+            <w:pPr>
+              <w:spacing w:after="60" w:line="264" w:lineRule="auto"/>
+            </w:pPr>
+            <w:r>
+              <w:t>2. 查询与筛选：路径、操作、结果、PID、最小耗时筛选正确；详情显示时间分解，导出的 JSON 只包含当前筛选结果。</w:t>
+            </w:r>
+          </w:p>
+          <w:p>
+            <w:pPr>
+              <w:spacing w:after="60" w:line="264" w:lineRule="auto"/>
+            </w:pPr>
+            <w:r>
+              <w:t>3. 统计口径：多次读取状态、日志和指标文件不增加业务读写计数或制造日志循环；能够解释内核缓存及内核提前拒绝请求的统计边界。</w:t>
+            </w:r>
+          </w:p>
+          <w:p>
+            <w:pPr>
+              <w:spacing w:after="60" w:line="264" w:lineRule="auto"/>
+            </w:pPr>
+            <w:r>
+              <w:t>4. 固定读取：同一句柄分段读取状态、日志和指标 JSON 可完整解析且内容固定；重新打开后能看到新操作。</w:t>
+            </w:r>
+          </w:p>
+          <w:p>
+            <w:pPr>
+              <w:spacing w:after="60" w:line="264" w:lineRule="auto"/>
+            </w:pPr>
+            <w:r>
+              <w:t>5. 连接状态：暂停后保持旧采样，恢复后继续更新；断开时明确显示旧数据及最后采样时间，重挂载后识别新会话。</w:t>
+            </w:r>
+          </w:p>
+          <w:p>
+            <w:pPr>
+              <w:spacing w:after="60" w:line="264" w:lineRule="auto"/>
+            </w:pPr>
+            <w:r>
+              <w:t>6. 日志故障：在独立测试目录模拟日志不可写，业务写入与同步仍成功；页面或状态显示日志错误和丢失量，修复后恢复记录。</w:t>
+            </w:r>
+          </w:p>
+          <w:p>
+            <w:pPr>
+              <w:spacing w:after="0" w:line="264" w:lineRule="auto"/>
+            </w:pPr>
+            <w:r>
+              <w:rPr>
+                <w:b/>
+              </w:rPr>
+              <w:t>验收凭证：</w:t>
+            </w:r>
+            <w:r>
+              <w:t>真实事件样本、筛选导出 JSON、时间分解截图、断线与恢复录屏、日志故障隔离记录。</w:t>
             </w:r>
           </w:p>
         </w:tc>

</xml_diff>

<commit_message>
Clarify final project deliverables and six module goals
</commit_message>
<xml_diff>
--- a/TeamFS六人分工.docx
+++ b/TeamFS六人分工.docx
@@ -5,7 +5,528 @@
     <w:p>
       <w:pPr>
         <w:pStyle w:val="Title"/>
+        <w:spacing w:after="200"/>
+        <w:jc w:val="center"/>
+      </w:pPr>
+      <w:r>
+        <w:t>TeamFS 项目目标与最终交付</w:t>
+      </w:r>
+    </w:p>
+    <w:p>
+      <w:pPr>
+        <w:pStyle w:val="GoalHeading"/>
+      </w:pPr>
+      <w:r>
+        <w:t>最终完成体</w:t>
+      </w:r>
+    </w:p>
+    <w:p>
+      <w:pPr>
+        <w:spacing w:after="80" w:line="269" w:lineRule="auto"/>
+      </w:pPr>
+      <w:r>
+        <w:t>完成一个基于 Rust + fuse-rs 的单机、单用户资料文件系统，在支持 FUSE 的 Linux 或 WSL2 中挂载使用。最终由资料目录、管理命令和真实监控网页组成，支持资料保存、历史比较、误操作恢复、独立备份和运行诊断。</w:t>
+      </w:r>
+    </w:p>
+    <w:p>
+      <w:pPr>
+        <w:spacing w:after="80" w:line="269" w:lineRule="auto"/>
+      </w:pPr>
+      <w:r>
+        <w:rPr>
+          <w:b/>
+        </w:rPr>
+        <w:t>资料目录：</w:t>
+      </w:r>
+      <w:r>
+        <w:t>用户通过编辑器、ls、cat、cp、mv 等普通工具读写报告、代码和图片；已成功同步的数据在重新挂载后保留。</w:t>
+      </w:r>
+    </w:p>
+    <w:p>
+      <w:pPr>
+        <w:spacing w:after="80" w:line="269" w:lineRule="auto"/>
+      </w:pPr>
+      <w:r>
+        <w:rPr>
+          <w:b/>
+        </w:rPr>
+        <w:t>管理命令：</w:t>
+      </w:r>
+      <w:r>
+        <w:t>通过 teamfs 命令执行同步、快照、差异比较、回收站管理、文件及目录恢复、备份导入和自检；历史与状态也可通过 .teamfs 查看。</w:t>
+      </w:r>
+    </w:p>
+    <w:p>
+      <w:pPr>
+        <w:spacing w:after="80" w:line="269" w:lineRule="auto"/>
+      </w:pPr>
+      <w:r>
+        <w:rPr>
+          <w:b/>
+        </w:rPr>
+        <w:t>监控网页：</w:t>
+      </w:r>
+      <w:r>
+        <w:t>只读展示真实挂载的保存状态、读写情况、操作日志、错误与耗时，支持筛选和导出。文件修改由普通软件与管理命令执行。</w:t>
+      </w:r>
+    </w:p>
+    <w:p>
+      <w:pPr>
+        <w:pStyle w:val="GoalHeading"/>
+      </w:pPr>
+      <w:r>
+        <w:t>六人共同实现的目标</w:t>
+      </w:r>
+    </w:p>
+    <w:tbl>
+      <w:tblPr>
+        <w:tblW w:type="dxa" w:w="10368"/>
+        <w:jc w:val="center"/>
+        <w:tblLayout w:type="fixed"/>
+        <w:tblLook w:firstColumn="1" w:firstRow="1" w:lastColumn="0" w:lastRow="0" w:noHBand="0" w:noVBand="1" w:val="04A0"/>
+        <w:tblBorders>
+          <w:top w:val="single" w:sz="6" w:color="D9D9D9"/>
+          <w:left w:val="single" w:sz="6" w:color="D9D9D9"/>
+          <w:bottom w:val="single" w:sz="6" w:color="D9D9D9"/>
+          <w:right w:val="single" w:sz="6" w:color="D9D9D9"/>
+          <w:insideH w:val="single" w:sz="6" w:color="D9D9D9"/>
+          <w:insideV w:val="single" w:sz="6" w:color="D9D9D9"/>
+        </w:tblBorders>
+      </w:tblPr>
+      <w:tblGrid>
+        <w:gridCol w:w="1037"/>
+        <w:gridCol w:w="9331"/>
+      </w:tblGrid>
+      <w:tr>
+        <w:trPr>
+          <w:cantSplit/>
+          <w:tblHeader/>
+        </w:trPr>
+        <w:tc>
+          <w:tcPr>
+            <w:tcW w:type="dxa" w:w="1037"/>
+            <w:vAlign w:val="center"/>
+            <w:tcMar>
+              <w:top w:w="65" w:type="dxa"/>
+              <w:bottom w:w="65" w:type="dxa"/>
+              <w:left w:w="100" w:type="dxa"/>
+              <w:right w:w="100" w:type="dxa"/>
+            </w:tcMar>
+            <w:shd w:fill="E8ECF0"/>
+          </w:tcPr>
+          <w:p>
+            <w:pPr>
+              <w:spacing w:line="264" w:lineRule="auto" w:after="0"/>
+              <w:jc w:val="center"/>
+            </w:pPr>
+            <w:r>
+              <w:rPr>
+                <w:b/>
+              </w:rPr>
+              <w:t>成员</w:t>
+            </w:r>
+          </w:p>
+        </w:tc>
+        <w:tc>
+          <w:tcPr>
+            <w:tcW w:type="dxa" w:w="9331"/>
+            <w:vAlign w:val="center"/>
+            <w:tcMar>
+              <w:top w:w="65" w:type="dxa"/>
+              <w:bottom w:w="65" w:type="dxa"/>
+              <w:left w:w="100" w:type="dxa"/>
+              <w:right w:w="100" w:type="dxa"/>
+            </w:tcMar>
+            <w:shd w:fill="E8ECF0"/>
+          </w:tcPr>
+          <w:p>
+            <w:pPr>
+              <w:spacing w:line="264" w:lineRule="auto" w:after="0"/>
+              <w:jc w:val="center"/>
+            </w:pPr>
+            <w:r>
+              <w:rPr>
+                <w:b/>
+              </w:rPr>
+              <w:t>模块完成后应达到的状态</w:t>
+            </w:r>
+          </w:p>
+        </w:tc>
+      </w:tr>
+      <w:tr>
+        <w:trPr>
+          <w:cantSplit/>
+        </w:trPr>
+        <w:tc>
+          <w:tcPr>
+            <w:tcW w:type="dxa" w:w="1037"/>
+            <w:vAlign w:val="center"/>
+            <w:tcMar>
+              <w:top w:w="65" w:type="dxa"/>
+              <w:bottom w:w="65" w:type="dxa"/>
+              <w:left w:w="100" w:type="dxa"/>
+              <w:right w:w="100" w:type="dxa"/>
+            </w:tcMar>
+          </w:tcPr>
+          <w:p>
+            <w:pPr>
+              <w:spacing w:line="264" w:lineRule="auto" w:after="0"/>
+              <w:jc w:val="center"/>
+            </w:pPr>
+            <w:r>
+              <w:rPr>
+                <w:b/>
+              </w:rPr>
+              <w:t>组长</w:t>
+            </w:r>
+          </w:p>
+        </w:tc>
+        <w:tc>
+          <w:tcPr>
+            <w:tcW w:type="dxa" w:w="9331"/>
+            <w:vAlign w:val="center"/>
+            <w:tcMar>
+              <w:top w:w="65" w:type="dxa"/>
+              <w:bottom w:w="65" w:type="dxa"/>
+              <w:left w:w="100" w:type="dxa"/>
+              <w:right w:w="100" w:type="dxa"/>
+            </w:tcMar>
+          </w:tcPr>
+          <w:p>
+            <w:pPr>
+              <w:spacing w:line="264" w:lineRule="auto" w:after="0"/>
+              <w:jc w:val="left"/>
+            </w:pPr>
+            <w:r>
+              <w:rPr>
+                <w:b w:val="0"/>
+              </w:rPr>
+              <w:t>把各模块整合为可独立运行、可复现、可现场演示的完整项目，统一发布版本和汇报材料。</w:t>
+            </w:r>
+          </w:p>
+        </w:tc>
+      </w:tr>
+      <w:tr>
+        <w:trPr>
+          <w:cantSplit/>
+        </w:trPr>
+        <w:tc>
+          <w:tcPr>
+            <w:tcW w:type="dxa" w:w="1037"/>
+            <w:vAlign w:val="center"/>
+            <w:tcMar>
+              <w:top w:w="65" w:type="dxa"/>
+              <w:bottom w:w="65" w:type="dxa"/>
+              <w:left w:w="100" w:type="dxa"/>
+              <w:right w:w="100" w:type="dxa"/>
+            </w:tcMar>
+          </w:tcPr>
+          <w:p>
+            <w:pPr>
+              <w:spacing w:line="264" w:lineRule="auto" w:after="0"/>
+              <w:jc w:val="center"/>
+            </w:pPr>
+            <w:r>
+              <w:rPr>
+                <w:b/>
+              </w:rPr>
+              <w:t>成员 2</w:t>
+            </w:r>
+          </w:p>
+        </w:tc>
+        <w:tc>
+          <w:tcPr>
+            <w:tcW w:type="dxa" w:w="9331"/>
+            <w:vAlign w:val="center"/>
+            <w:tcMar>
+              <w:top w:w="65" w:type="dxa"/>
+              <w:bottom w:w="65" w:type="dxa"/>
+              <w:left w:w="100" w:type="dxa"/>
+              <w:right w:w="100" w:type="dxa"/>
+            </w:tcMar>
+          </w:tcPr>
+          <w:p>
+            <w:pPr>
+              <w:spacing w:line="264" w:lineRule="auto" w:after="0"/>
+              <w:jc w:val="left"/>
+            </w:pPr>
+            <w:r>
+              <w:rPr>
+                <w:b w:val="0"/>
+              </w:rPr>
+              <w:t>保证基础操作及已声明支持的软件场景行为正确，明确错误处理和兼容性边界。</w:t>
+            </w:r>
+          </w:p>
+        </w:tc>
+      </w:tr>
+      <w:tr>
+        <w:trPr>
+          <w:cantSplit/>
+        </w:trPr>
+        <w:tc>
+          <w:tcPr>
+            <w:tcW w:type="dxa" w:w="1037"/>
+            <w:vAlign w:val="center"/>
+            <w:tcMar>
+              <w:top w:w="65" w:type="dxa"/>
+              <w:bottom w:w="65" w:type="dxa"/>
+              <w:left w:w="100" w:type="dxa"/>
+              <w:right w:w="100" w:type="dxa"/>
+            </w:tcMar>
+          </w:tcPr>
+          <w:p>
+            <w:pPr>
+              <w:spacing w:line="264" w:lineRule="auto" w:after="0"/>
+              <w:jc w:val="center"/>
+            </w:pPr>
+            <w:r>
+              <w:rPr>
+                <w:b/>
+              </w:rPr>
+              <w:t>成员 3</w:t>
+            </w:r>
+          </w:p>
+        </w:tc>
+        <w:tc>
+          <w:tcPr>
+            <w:tcW w:type="dxa" w:w="9331"/>
+            <w:vAlign w:val="center"/>
+            <w:tcMar>
+              <w:top w:w="65" w:type="dxa"/>
+              <w:bottom w:w="65" w:type="dxa"/>
+              <w:left w:w="100" w:type="dxa"/>
+              <w:right w:w="100" w:type="dxa"/>
+            </w:tcMar>
+          </w:tcPr>
+          <w:p>
+            <w:pPr>
+              <w:spacing w:line="264" w:lineRule="auto" w:after="0"/>
+              <w:jc w:val="left"/>
+            </w:pPr>
+            <w:r>
+              <w:rPr>
+                <w:b w:val="0"/>
+              </w:rPr>
+              <w:t>保证成功同步的数据可恢复，保存失败不破坏旧提交，环境与存储问题可以诊断。</w:t>
+            </w:r>
+          </w:p>
+        </w:tc>
+      </w:tr>
+      <w:tr>
+        <w:trPr>
+          <w:cantSplit/>
+        </w:trPr>
+        <w:tc>
+          <w:tcPr>
+            <w:tcW w:type="dxa" w:w="1037"/>
+            <w:vAlign w:val="center"/>
+            <w:tcMar>
+              <w:top w:w="65" w:type="dxa"/>
+              <w:bottom w:w="65" w:type="dxa"/>
+              <w:left w:w="100" w:type="dxa"/>
+              <w:right w:w="100" w:type="dxa"/>
+            </w:tcMar>
+          </w:tcPr>
+          <w:p>
+            <w:pPr>
+              <w:spacing w:line="264" w:lineRule="auto" w:after="0"/>
+              <w:jc w:val="center"/>
+            </w:pPr>
+            <w:r>
+              <w:rPr>
+                <w:b/>
+              </w:rPr>
+              <w:t>成员 4</w:t>
+            </w:r>
+          </w:p>
+        </w:tc>
+        <w:tc>
+          <w:tcPr>
+            <w:tcW w:type="dxa" w:w="9331"/>
+            <w:vAlign w:val="center"/>
+            <w:tcMar>
+              <w:top w:w="65" w:type="dxa"/>
+              <w:bottom w:w="65" w:type="dxa"/>
+              <w:left w:w="100" w:type="dxa"/>
+              <w:right w:w="100" w:type="dxa"/>
+            </w:tcMar>
+          </w:tcPr>
+          <w:p>
+            <w:pPr>
+              <w:spacing w:line="264" w:lineRule="auto" w:after="0"/>
+              <w:jc w:val="left"/>
+            </w:pPr>
+            <w:r>
+              <w:rPr>
+                <w:b w:val="0"/>
+              </w:rPr>
+              <w:t>让误改、误删的资料可以取回，并能比较历史、校验恢复结果、导入独立备份。</w:t>
+            </w:r>
+          </w:p>
+        </w:tc>
+      </w:tr>
+      <w:tr>
+        <w:trPr>
+          <w:cantSplit/>
+        </w:trPr>
+        <w:tc>
+          <w:tcPr>
+            <w:tcW w:type="dxa" w:w="1037"/>
+            <w:vAlign w:val="center"/>
+            <w:tcMar>
+              <w:top w:w="65" w:type="dxa"/>
+              <w:bottom w:w="65" w:type="dxa"/>
+              <w:left w:w="100" w:type="dxa"/>
+              <w:right w:w="100" w:type="dxa"/>
+            </w:tcMar>
+          </w:tcPr>
+          <w:p>
+            <w:pPr>
+              <w:spacing w:line="264" w:lineRule="auto" w:after="0"/>
+              <w:jc w:val="center"/>
+            </w:pPr>
+            <w:r>
+              <w:rPr>
+                <w:b/>
+              </w:rPr>
+              <w:t>成员 5</w:t>
+            </w:r>
+          </w:p>
+        </w:tc>
+        <w:tc>
+          <w:tcPr>
+            <w:tcW w:type="dxa" w:w="9331"/>
+            <w:vAlign w:val="center"/>
+            <w:tcMar>
+              <w:top w:w="65" w:type="dxa"/>
+              <w:bottom w:w="65" w:type="dxa"/>
+              <w:left w:w="100" w:type="dxa"/>
+              <w:right w:w="100" w:type="dxa"/>
+            </w:tcMar>
+          </w:tcPr>
+          <w:p>
+            <w:pPr>
+              <w:spacing w:line="264" w:lineRule="auto" w:after="0"/>
+              <w:jc w:val="left"/>
+            </w:pPr>
+            <w:r>
+              <w:rPr>
+                <w:b w:val="0"/>
+              </w:rPr>
+              <w:t>让缓存和保存成本有真实测量依据，能定位耗时与资源开销并提出有证据的优化建议。</w:t>
+            </w:r>
+          </w:p>
+        </w:tc>
+      </w:tr>
+      <w:tr>
+        <w:trPr>
+          <w:cantSplit/>
+        </w:trPr>
+        <w:tc>
+          <w:tcPr>
+            <w:tcW w:type="dxa" w:w="1037"/>
+            <w:vAlign w:val="center"/>
+            <w:tcMar>
+              <w:top w:w="65" w:type="dxa"/>
+              <w:bottom w:w="65" w:type="dxa"/>
+              <w:left w:w="100" w:type="dxa"/>
+              <w:right w:w="100" w:type="dxa"/>
+            </w:tcMar>
+          </w:tcPr>
+          <w:p>
+            <w:pPr>
+              <w:spacing w:line="264" w:lineRule="auto" w:after="0"/>
+              <w:jc w:val="center"/>
+            </w:pPr>
+            <w:r>
+              <w:rPr>
+                <w:b/>
+              </w:rPr>
+              <w:t>成员 6</w:t>
+            </w:r>
+          </w:p>
+        </w:tc>
+        <w:tc>
+          <w:tcPr>
+            <w:tcW w:type="dxa" w:w="9331"/>
+            <w:vAlign w:val="center"/>
+            <w:tcMar>
+              <w:top w:w="65" w:type="dxa"/>
+              <w:bottom w:w="65" w:type="dxa"/>
+              <w:left w:w="100" w:type="dxa"/>
+              <w:right w:w="100" w:type="dxa"/>
+            </w:tcMar>
+          </w:tcPr>
+          <w:p>
+            <w:pPr>
+              <w:spacing w:line="264" w:lineRule="auto" w:after="0"/>
+              <w:jc w:val="left"/>
+            </w:pPr>
+            <w:r>
+              <w:rPr>
+                <w:b w:val="0"/>
+              </w:rPr>
+              <w:t>让操作、错误和等待在真实监控中可见，页面准确说明采样状态与统计范围。</w:t>
+            </w:r>
+          </w:p>
+        </w:tc>
+      </w:tr>
+    </w:tbl>
+    <w:p>
+      <w:pPr>
+        <w:pStyle w:val="GoalHeading"/>
+      </w:pPr>
+      <w:r>
+        <w:t>交付与整体完成标准</w:t>
+      </w:r>
+    </w:p>
+    <w:p>
+      <w:pPr>
+        <w:spacing w:after="80" w:line="269" w:lineRule="auto"/>
+      </w:pPr>
+      <w:r>
+        <w:rPr>
+          <w:b/>
+        </w:rPr>
+        <w:t>交付内容：</w:t>
+      </w:r>
+      <w:r>
+        <w:t>源码与可运行程序、启动和卸载脚本、一键演示、监控页面、README、验收与性能报告、分工材料及答辩 PPT。其他成员应能按说明在另一套合适环境中独立运行。</w:t>
+      </w:r>
+    </w:p>
+    <w:p>
+      <w:pPr>
+        <w:spacing w:after="80" w:line="269" w:lineRule="auto"/>
+      </w:pPr>
+      <w:r>
+        <w:rPr>
+          <w:b/>
+        </w:rPr>
+        <w:t>演示流程：</w:t>
+      </w:r>
+      <w:r>
+        <w:t>创建报告 → 同步并重新挂载 → 建立快照 → 修改并比较差异 → 恢复旧内容 → 误删后从回收站恢复 → 校验备份并导入新存储 → 查看真实监控。</w:t>
+      </w:r>
+    </w:p>
+    <w:p>
+      <w:pPr>
+        <w:spacing w:after="80" w:line="269" w:lineRule="auto"/>
+      </w:pPr>
+      <w:r>
+        <w:rPr>
+          <w:b/>
+        </w:rPr>
+        <w:t>完成判定：</w:t>
+      </w:r>
+      <w:r>
+        <w:t>整体流程可复现，支持范围内的验收通过，六个人能解释各自模块；不支持项、环境跳过和保存条件在说明中明确。具体操作、通过标准及验收凭证按后续分工表执行。</w:t>
+      </w:r>
+    </w:p>
+    <w:p>
+      <w:pPr>
+        <w:pStyle w:val="Title"/>
         <w:keepNext/>
+        <w:pageBreakBefore/>
         <w:spacing w:after="180"/>
         <w:jc w:val="center"/>
       </w:pPr>
@@ -13508,6 +14029,20 @@
       </w:tcPr>
     </w:tblStylePr>
   </w:style>
+  <w:style w:type="paragraph" w:customStyle="1" w:styleId="GoalHeading">
+    <w:name w:val="GoalHeading"/>
+    <w:basedOn w:val="Normal"/>
+    <w:pPr>
+      <w:keepNext/>
+      <w:spacing w:before="180" w:after="100"/>
+    </w:pPr>
+    <w:rPr>
+      <w:rFonts w:ascii="Calibri" w:hAnsi="Calibri" w:eastAsia="黑体"/>
+      <w:b/>
+      <w:color w:val="000000"/>
+      <w:sz w:val="24"/>
+    </w:rPr>
+  </w:style>
 </w:styles>
 </file>
 

</xml_diff>

<commit_message>
feat: add pinned experiment input provenance and block storage
</commit_message>
<xml_diff>
--- a/TeamFS六人分工.docx
+++ b/TeamFS六人分工.docx
@@ -9,7 +9,11 @@
         <w:jc w:val="center"/>
       </w:pPr>
       <w:r>
-        <w:t>TeamFS 项目目标与最终交付</w:t>
+        <w:rPr>
+          <w:b/>
+          <w:color w:val="000000"/>
+        </w:rPr>
+        <w:t>TeamFS 科研实验输入追溯目标与分工</w:t>
       </w:r>
     </w:p>
     <w:p>
@@ -17,6 +21,10 @@
         <w:pStyle w:val="GoalHeading"/>
       </w:pPr>
       <w:r>
+        <w:rPr>
+          <w:b/>
+          <w:color w:val="000000"/>
+        </w:rPr>
         <w:t>最终完成体</w:t>
       </w:r>
     </w:p>
@@ -25,7 +33,11 @@
         <w:spacing w:after="80" w:line="269" w:lineRule="auto"/>
       </w:pPr>
       <w:r>
-        <w:t>完成一个基于 Rust + fuse-rs 的单机、单用户资料文件系统，在支持 FUSE 的 Linux 或 WSL2 中挂载使用。最终由资料目录、管理命令和真实监控网页组成，支持资料保存、历史比较、误操作恢复、独立备份和运行诊断。</w:t>
+        <w:rPr>
+          <w:b w:val="0"/>
+          <w:color w:val="000000"/>
+        </w:rPr>
+        <w:t>完成一个基于 Rust + fuse-rs 的科研实验文件输入追溯系统，在 Linux 或 WSL2 中使用。一次运行可固定输入版本、记录实际访问、关联结果，并能验证、取回和重放旧输入。</w:t>
       </w:r>
     </w:p>
     <w:p>
@@ -35,11 +47,16 @@
       <w:r>
         <w:rPr>
           <w:b/>
+          <w:color w:val="000000"/>
         </w:rPr>
-        <w:t>资料目录：</w:t>
+        <w:t>输入目录：</w:t>
       </w:r>
       <w:r>
-        <w:t>用户通过编辑器、ls、cat、cp、mv 等普通工具读写报告、代码和图片；已成功同步的数据在重新挂载后保留。</w:t>
+        <w:rPr>
+          <w:b w:val="0"/>
+          <w:color w:val="000000"/>
+        </w:rPr>
+        <w:t>程序在固定的只读输入目录中运行，结果写到挂载点外。范围为单机单用户的挂载内文件输入，外部依赖、网络和随机性不保证完整采集。</w:t>
       </w:r>
     </w:p>
     <w:p>
@@ -49,11 +66,16 @@
       <w:r>
         <w:rPr>
           <w:b/>
+          <w:color w:val="000000"/>
         </w:rPr>
         <w:t>管理命令：</w:t>
       </w:r>
       <w:r>
-        <w:t>通过 teamfs 命令执行同步、快照、差异比较、回收站管理、文件及目录恢复、备份导入和自检；历史与状态也可通过 .teamfs 查看。</w:t>
+        <w:rPr>
+          <w:b w:val="0"/>
+          <w:color w:val="000000"/>
+        </w:rPr>
+        <w:t>通过 experiment 命令运行、查看、验证、比较和重放实验，结合恢复与独立备份保留输入。现有快照、分块存储和诊断作为基础。</w:t>
       </w:r>
     </w:p>
     <w:p>
@@ -63,11 +85,16 @@
       <w:r>
         <w:rPr>
           <w:b/>
+          <w:color w:val="000000"/>
         </w:rPr>
-        <w:t>监控网页：</w:t>
+        <w:t>展示页面：</w:t>
       </w:r>
       <w:r>
-        <w:t>只读展示真实挂载的保存状态、读写情况、操作日志、错误与耗时，支持筛选和导出。文件修改由普通软件与管理命令执行。</w:t>
+        <w:rPr>
+          <w:b w:val="0"/>
+          <w:color w:val="000000"/>
+        </w:rPr>
+        <w:t>只读展示真实实验报告、输入与输出版本、差异和异常状态；与原有操作监控共同使用，明确区分教学模拟和真实数据。</w:t>
       </w:r>
     </w:p>
     <w:p>
@@ -75,7 +102,11 @@
         <w:pStyle w:val="GoalHeading"/>
       </w:pPr>
       <w:r>
-        <w:t>六人共同实现的目标</w:t>
+        <w:rPr>
+          <w:b/>
+          <w:color w:val="000000"/>
+        </w:rPr>
+        <w:t>六人本轮目标</w:t>
       </w:r>
     </w:p>
     <w:tbl>
@@ -147,8 +178,9 @@
             <w:r>
               <w:rPr>
                 <w:b/>
+                <w:color w:val="000000"/>
               </w:rPr>
-              <w:t>模块完成后应达到的状态</w:t>
+              <w:t>本轮应达到的状态</w:t>
             </w:r>
           </w:p>
         </w:tc>
@@ -176,6 +208,7 @@
             <w:r>
               <w:rPr>
                 <w:b/>
+                <w:color w:val="000000"/>
               </w:rPr>
               <w:t>组长</w:t>
             </w:r>
@@ -200,8 +233,9 @@
             <w:r>
               <w:rPr>
                 <w:b w:val="0"/>
+                <w:color w:val="000000"/>
               </w:rPr>
-              <w:t>把各模块整合为可独立运行、可复现、可现场演示的完整项目，统一发布版本和汇报材料。</w:t>
+              <w:t>围绕科研输入追溯整合各模块，统一接口、整体验收、换机复现、版本发布和答辩材料。</w:t>
             </w:r>
           </w:p>
         </w:tc>
@@ -229,6 +263,7 @@
             <w:r>
               <w:rPr>
                 <w:b/>
+                <w:color w:val="000000"/>
               </w:rPr>
               <w:t>成员 2</w:t>
             </w:r>
@@ -253,8 +288,9 @@
             <w:r>
               <w:rPr>
                 <w:b w:val="0"/>
+                <w:color w:val="000000"/>
               </w:rPr>
-              <w:t>保证基础操作及已声明支持的软件场景行为正确，明确错误处理和兼容性边界。</w:t>
+              <w:t>保证记录与实际文件访问一致，正确区分正文、仅打开、元数据查询和实验进程归属。</w:t>
             </w:r>
           </w:p>
         </w:tc>
@@ -282,6 +318,7 @@
             <w:r>
               <w:rPr>
                 <w:b/>
+                <w:color w:val="000000"/>
               </w:rPr>
               <w:t>成员 3</w:t>
             </w:r>
@@ -306,8 +343,9 @@
             <w:r>
               <w:rPr>
                 <w:b w:val="0"/>
+                <w:color w:val="000000"/>
               </w:rPr>
-              <w:t>保证成功同步的数据可恢复，保存失败不破坏旧提交，环境与存储问题可以诊断。</w:t>
+              <w:t>保留固定输入版本和已采集证据，清楚区分成功保存、取消、中断以及无法恢复的状态。</w:t>
             </w:r>
           </w:p>
         </w:tc>
@@ -335,6 +373,7 @@
             <w:r>
               <w:rPr>
                 <w:b/>
+                <w:color w:val="000000"/>
               </w:rPr>
               <w:t>成员 4</w:t>
             </w:r>
@@ -359,8 +398,9 @@
             <w:r>
               <w:rPr>
                 <w:b w:val="0"/>
+                <w:color w:val="000000"/>
               </w:rPr>
-              <w:t>让误改、误删的资料可以取回，并能比较历史、校验恢复结果、导入独立备份。</w:t>
+              <w:t>用实际分析流程证明需求，关联输入和输出版本，并通过报告比较及重放查证实验结果。</w:t>
             </w:r>
           </w:p>
         </w:tc>
@@ -388,6 +428,7 @@
             <w:r>
               <w:rPr>
                 <w:b/>
+                <w:color w:val="000000"/>
               </w:rPr>
               <w:t>成员 5</w:t>
             </w:r>
@@ -412,8 +453,9 @@
             <w:r>
               <w:rPr>
                 <w:b w:val="0"/>
+                <w:color w:val="000000"/>
               </w:rPr>
-              <w:t>让缓存和保存成本有真实测量依据，能定位耗时与资源开销并提出有证据的优化建议。</w:t>
+              <w:t>量化原生目录、普通 TeamFS 和实验模式的成本，解释追溯的代价并提出有数据支持的优化。</w:t>
             </w:r>
           </w:p>
         </w:tc>
@@ -441,6 +483,7 @@
             <w:r>
               <w:rPr>
                 <w:b/>
+                <w:color w:val="000000"/>
               </w:rPr>
               <w:t>成员 6</w:t>
             </w:r>
@@ -465,8 +508,9 @@
             <w:r>
               <w:rPr>
                 <w:b w:val="0"/>
+                <w:color w:val="000000"/>
               </w:rPr>
-              <w:t>让操作、错误和等待在真实监控中可见，页面准确说明采样状态与统计范围。</w:t>
+              <w:t>用真实报告展示实验、输入、输出、变化和异常状态，让观众理解结果对应的是哪一版数据。</w:t>
             </w:r>
           </w:p>
         </w:tc>
@@ -477,6 +521,10 @@
         <w:pStyle w:val="GoalHeading"/>
       </w:pPr>
       <w:r>
+        <w:rPr>
+          <w:b/>
+          <w:color w:val="000000"/>
+        </w:rPr>
         <w:t>交付与整体完成标准</w:t>
       </w:r>
     </w:p>
@@ -487,11 +535,16 @@
       <w:r>
         <w:rPr>
           <w:b/>
+          <w:color w:val="000000"/>
         </w:rPr>
         <w:t>交付内容：</w:t>
       </w:r>
       <w:r>
-        <w:t>源码与可运行程序、启动和卸载脚本、一键演示、监控页面、README、验收与性能报告、分工材料及答辩 PPT。其他成员应能按说明在另一套合适环境中独立运行。</w:t>
+        <w:rPr>
+          <w:b w:val="0"/>
+          <w:color w:val="000000"/>
+        </w:rPr>
+        <w:t>源码和可运行程序、科研案例及数据说明、启动与演示脚本、真实报告页面、README、验收和开销评估、分工材料及答辩 PPT。</w:t>
       </w:r>
     </w:p>
     <w:p>
@@ -501,11 +554,16 @@
       <w:r>
         <w:rPr>
           <w:b/>
+          <w:color w:val="000000"/>
         </w:rPr>
         <w:t>演示流程：</w:t>
       </w:r>
       <w:r>
-        <w:t>创建报告 → 同步并重新挂载 → 建立快照 → 修改并比较差异 → 恢复旧内容 → 误删后从回收站恢复 → 校验备份并导入新存储 → 查看真实监控。</w:t>
+        <w:rPr>
+          <w:b w:val="0"/>
+          <w:color w:val="000000"/>
+        </w:rPr>
+        <w:t>准备输入 → 运行并记录 → 修改同名数据或参数 → 结果变化 → 按旧报告重放 → 对照输入与结果 SHA256 → 查看报告和真实状态。</w:t>
       </w:r>
     </w:p>
     <w:p>
@@ -515,11 +573,16 @@
       <w:r>
         <w:rPr>
           <w:b/>
+          <w:color w:val="000000"/>
         </w:rPr>
         <w:t>完成判定：</w:t>
       </w:r>
       <w:r>
-        <w:t>整体流程可复现，支持范围内的验收通过，六个人能解释各自模块；不支持项、环境跳过和保存条件在说明中明确。具体操作、通过标准及验收凭证按后续分工表执行。</w:t>
+        <w:rPr>
+          <w:b w:val="0"/>
+          <w:color w:val="000000"/>
+        </w:rPr>
+        <w:t>同环境确定性案例重放结果一致；支持范围验收通过，性能代价和追溯范围讲清楚；另一位成员能独立复现，GitHub 提交与验收凭证一致。</w:t>
       </w:r>
     </w:p>
     <w:p>
@@ -531,6 +594,10 @@
         <w:jc w:val="center"/>
       </w:pPr>
       <w:r>
+        <w:rPr>
+          <w:b/>
+          <w:color w:val="000000"/>
+        </w:rPr>
         <w:t>TeamFS 小组分工与验收标准</w:t>
       </w:r>
     </w:p>
@@ -540,7 +607,11 @@
         <w:spacing w:after="200" w:line="276" w:lineRule="auto"/>
       </w:pPr>
       <w:r>
-        <w:t>每位成员按本人验收项复测并提交凭证。实验使用独立临时挂载点和存储，记录运行环境、提交号及实际结果。</w:t>
+        <w:rPr>
+          <w:b w:val="0"/>
+          <w:color w:val="000000"/>
+        </w:rPr>
+        <w:t>以当前 0.8 实现为基础。各成员先复核、测试和讲解所负责模块，再完成本轮新增工作及必要修正。新增重点是结果证据、采集中途保存、实际案例、开销评估和报告页面；均使用独立测试挂载。</w:t>
       </w:r>
     </w:p>
     <w:tbl>
@@ -763,7 +834,7 @@
                 <w:b w:val="0"/>
                 <w:color w:val="000000"/>
               </w:rPr>
-              <w:t>梳理应用 → VFS → FUSE → Rust → 存储的调用过程；维护 CLI 和挂载入口；协调接口修改；组织完整验收、GitHub 整理及最终演示。</w:t>
+              <w:t>梳理输入固定、命令运行、FUSE 记录和报告导出的过程；协调接口与集成；组织整体验收、换机复现、GitHub 发布及答辩。</w:t>
             </w:r>
           </w:p>
         </w:tc>
@@ -790,7 +861,7 @@
                 <w:b w:val="0"/>
                 <w:color w:val="000000"/>
               </w:rPr>
-              <w:t>系统架构图、完整演示脚本、可复现运行说明、最终版本与汇报材料。</w:t>
+              <w:t>系统架构图、统一运行说明、完整演示脚本、最终验收与发布记录、PPT。</w:t>
             </w:r>
           </w:p>
         </w:tc>
@@ -838,56 +909,87 @@
           </w:tcPr>
           <w:p>
             <w:pPr>
+              <w:keepNext w:val="0"/>
               <w:spacing w:after="60" w:line="264" w:lineRule="auto"/>
             </w:pPr>
             <w:r>
-              <w:t>1. 换机复现：由另一名成员按 README 克隆、构建、挂载、读写、同步并卸载成功；不依赖组长电脑上的额外文件。</w:t>
+              <w:rPr>
+                <w:b w:val="0"/>
+                <w:color w:val="000000"/>
+              </w:rPr>
+              <w:t>1. 原理讲解：能追踪一次文件读取和一次实验启动，说明应用、VFS、FUSE、Rust 服务与 SQLite 的关系，并定位对应代码。</w:t>
             </w:r>
           </w:p>
           <w:p>
             <w:pPr>
+              <w:keepNext w:val="0"/>
               <w:spacing w:after="60" w:line="264" w:lineRule="auto"/>
             </w:pPr>
             <w:r>
-              <w:t>2. 集成检查：运行 scripts/check.sh，退出码为 0，报告无 fail；不支持和环境跳过须单独列明，未执行的测试不能算通过。</w:t>
+              <w:rPr>
+                <w:b w:val="0"/>
+                <w:color w:val="000000"/>
+              </w:rPr>
+              <w:t>2. 集成验收：最终提交运行 scripts/check.sh，退出码为 0；失败、不支持和环境跳过分别说明，未执行项不算通过。</w:t>
             </w:r>
           </w:p>
           <w:p>
             <w:pPr>
+              <w:keepNext w:val="0"/>
               <w:spacing w:after="60" w:line="264" w:lineRule="auto"/>
             </w:pPr>
             <w:r>
-              <w:t>3. 完整演示：连续完成写报告、同步重挂载、快照、修改与恢复、误删与回收恢复、查看监控；恢复内容与原稿一致。</w:t>
+              <w:rPr>
+                <w:b w:val="0"/>
+                <w:color w:val="000000"/>
+              </w:rPr>
+              <w:t>3. 换机复现：另一名成员在新环境按 README 克隆、安装、构建并运行科研案例，完成报告查看、输入验证和旧版本重放。</w:t>
             </w:r>
           </w:p>
           <w:p>
             <w:pPr>
+              <w:keepNext w:val="0"/>
               <w:spacing w:after="60" w:line="264" w:lineRule="auto"/>
             </w:pPr>
             <w:r>
-              <w:t>4. 原理讲解：分别追踪一次读取和写入，能说明应用、VFS、FUSE、Rust 回调及存储的关系，并定位对应代码。</w:t>
+              <w:rPr>
+                <w:b w:val="0"/>
+                <w:color w:val="000000"/>
+              </w:rPr>
+              <w:t>4. 现场演示：连续完成原实验、修改同名输入、重新运行、旧输入重放、结果对照和页面展示；同环境确定性结果校验一致。</w:t>
             </w:r>
           </w:p>
           <w:p>
             <w:pPr>
+              <w:keepNext w:val="0"/>
               <w:spacing w:after="60" w:line="264" w:lineRule="auto"/>
             </w:pPr>
             <w:r>
-              <w:t>5. 发布核对：GitHub 目标分支的提交号与验收版本一致；保存 CI 结果。云端未运行挂载测试时，须注明并附本地真实挂载结果。</w:t>
+              <w:rPr>
+                <w:b w:val="0"/>
+                <w:color w:val="000000"/>
+              </w:rPr>
+              <w:t>5. 发布与汇报：GitHub 提交号与验收版本一致，保存 CI 结果；PPT 讲清需求、方案、实测结果和范围，不宣称完整环境自动复现。</w:t>
             </w:r>
           </w:p>
           <w:p>
             <w:pPr>
+              <w:keepNext w:val="0"/>
               <w:spacing w:after="0" w:line="264" w:lineRule="auto"/>
             </w:pPr>
             <w:r>
               <w:rPr>
                 <w:b/>
+                <w:color w:val="000000"/>
               </w:rPr>
               <w:t>验收凭证：</w:t>
             </w:r>
             <w:r>
-              <w:t>环境与提交号、换机操作记录、完整验收输出、演示录屏、架构图、GitHub 与 CI 链接。</w:t>
+              <w:rPr>
+                <w:b w:val="0"/>
+                <w:color w:val="000000"/>
+              </w:rPr>
+              <w:t>架构图、最终提交号、完整验收输出、换机记录、演示录屏、GitHub 与 CI 链接、PPT。</w:t>
             </w:r>
           </w:p>
         </w:tc>
@@ -946,7 +1048,7 @@
                 <w:b w:val="0"/>
                 <w:color w:val="000000"/>
               </w:rPr>
-              <w:t>基础文件操作与软件兼容性</w:t>
+              <w:t>FUSE 访问记录与进程归属</w:t>
             </w:r>
           </w:p>
         </w:tc>
@@ -973,7 +1075,7 @@
                 <w:b w:val="0"/>
                 <w:color w:val="000000"/>
               </w:rPr>
-              <w:t>理解 inode、目录项、句柄和引用计数；复核读写、截断、改名、删除、权限和错误码；负责 Git、Vim、rsync 与随机对照测试。</w:t>
+              <w:t>复核 FUSE 回调和专用采集会话；检查进程组归属、访问分类、原始路径、软链接与错误记录；复测基础操作和软件兼容性。</w:t>
             </w:r>
           </w:p>
         </w:tc>
@@ -1000,7 +1102,7 @@
                 <w:b w:val="0"/>
                 <w:color w:val="000000"/>
               </w:rPr>
-              <w:t>基础操作流程说明、兼容性清单、随机测试复现记录、发现问题后的修正。</w:t>
+              <w:t>访问记录流程说明、进程归属与边界测试、兼容性复测结果、必要的代码修正。</w:t>
             </w:r>
           </w:p>
         </w:tc>
@@ -1048,56 +1150,87 @@
           </w:tcPr>
           <w:p>
             <w:pPr>
+              <w:keepNext w:val="0"/>
               <w:spacing w:after="60" w:line="264" w:lineRule="auto"/>
             </w:pPr>
             <w:r>
-              <w:t>1. 基础操作：中文名、非 UTF-8 名称、二进制与空文件的创建和读写正确；偏移写、追加、截断、改名与目录操作结果符合预期。</w:t>
+              <w:rPr>
+                <w:b w:val="0"/>
+                <w:color w:val="000000"/>
+              </w:rPr>
+              <w:t>1. 访问分类：正文读取、仅打开、属性查询和目录查询分别记录；未读取的备用文件不列为正文输入，空文件也能正确识别。</w:t>
             </w:r>
           </w:p>
           <w:p>
             <w:pPr>
+              <w:keepNext w:val="0"/>
               <w:spacing w:after="60" w:line="264" w:lineRule="auto"/>
             </w:pPr>
             <w:r>
-              <w:t>2. 句柄与并发：删除或被改名覆盖的文件，其已有句柄仍可读写；并发追加记录无缺失，原子替换期间读取不到半个新文件或短暂缺失的目标。</w:t>
+              <w:rPr>
+                <w:b w:val="0"/>
+                <w:color w:val="000000"/>
+              </w:rPr>
+              <w:t>2. 归属与完整性：普通子进程访问纳入本实验，其他进程访问同一快照不混入；超过日志窗口的重复读取次数和字节数仍准确。</w:t>
             </w:r>
           </w:p>
           <w:p>
             <w:pPr>
+              <w:keepNext w:val="0"/>
               <w:spacing w:after="60" w:line="264" w:lineRule="auto"/>
             </w:pPr>
             <w:r>
-              <w:t>3. 软件兼容：在 direct 与 cached 模式运行 Git、Vim、rsync 和文件锁场景；支持项无失败，不支持项及 SQLite 保存边界注明原因。</w:t>
+              <w:rPr>
+                <w:b w:val="0"/>
+                <w:color w:val="000000"/>
+              </w:rPr>
+              <w:t>3. 路径与校验：中文、非 UTF-8 名称、二进制和局部读取记录正确；SHA256 标识完整文件版本，不把返回字节都宣称为算法使用。</w:t>
             </w:r>
           </w:p>
           <w:p>
             <w:pPr>
+              <w:keepNext w:val="0"/>
               <w:spacing w:after="60" w:line="264" w:lineRule="auto"/>
             </w:pPr>
             <w:r>
-              <w:t>4. 随机对照：两种模式各跑 3 个固定种子，每组 180 次操作；内容、路径和错误结果与原生目录对照一致，重挂载恢复到正确保存点。</w:t>
+              <w:rPr>
+                <w:b w:val="0"/>
+                <w:color w:val="000000"/>
+              </w:rPr>
+              <w:t>4. 边界与错误：缺失输入记录 errno；未固定输入和越界软链接有明确提示，不能被认证为已固定输入；离开进程组的情况注明范围。</w:t>
             </w:r>
           </w:p>
           <w:p>
             <w:pPr>
+              <w:keepNext w:val="0"/>
               <w:spacing w:after="60" w:line="264" w:lineRule="auto"/>
             </w:pPr>
             <w:r>
-              <w:t>5. 错误处理：目标已存在、目录非空、无权限、类型冲突及非法路径返回相应错误；失败操作不破坏原文件，不留下半成品。</w:t>
+              <w:rPr>
+                <w:b w:val="0"/>
+                <w:color w:val="000000"/>
+              </w:rPr>
+              <w:t>5. 基础回归：支持范围内的读写、截断、改名、打开后删除及 Git、Vim、rsync 场景继续通过；不支持项及失败修正有记录。</w:t>
             </w:r>
           </w:p>
           <w:p>
             <w:pPr>
+              <w:keepNext w:val="0"/>
               <w:spacing w:after="0" w:line="264" w:lineRule="auto"/>
             </w:pPr>
             <w:r>
               <w:rPr>
                 <w:b/>
+                <w:color w:val="000000"/>
               </w:rPr>
               <w:t>验收凭证：</w:t>
             </w:r>
             <w:r>
-              <w:t>基础操作日志、兼容性 JSON、随机种子和操作序列、问题修复前后对比及复测记录。</w:t>
+              <w:rPr>
+                <w:b w:val="0"/>
+                <w:color w:val="000000"/>
+              </w:rPr>
+              <w:t>真实请求与报告对照、分类和子进程测试、2500 次读取记录、路径与错误案例、兼容性复测及修正说明。</w:t>
             </w:r>
           </w:p>
         </w:tc>
@@ -1156,7 +1289,7 @@
                 <w:b w:val="0"/>
                 <w:color w:val="000000"/>
               </w:rPr>
-              <w:t>持久化、同步与故障诊断</w:t>
+              <w:t>输入版本留存与中断恢复</w:t>
             </w:r>
           </w:p>
         </w:tc>
@@ -1183,7 +1316,7 @@
                 <w:b w:val="0"/>
                 <w:color w:val="000000"/>
               </w:rPr>
-              <w:t>理解 SQLite 表结构、事务和保存边界；复核手动与自动同步、正常卸载、异常退出、写入失败重试；检查 check、doctor 的行为。</w:t>
+              <w:t>复核快照、分块存储、事务和备份；新增采集摘要的中途持久保存；完善中断恢复和失败状态，保证旧版本不被当前修改影响。</w:t>
             </w:r>
           </w:p>
         </w:tc>
@@ -1210,7 +1343,7 @@
                 <w:b w:val="0"/>
                 <w:color w:val="000000"/>
               </w:rPr>
-              <w:t>存储结构图、保存时序图、故障实验报告、自检操作说明。</w:t>
+              <w:t>存储与保存时序图、采集中途保存实现、故障验收报告、输入与报告迁移说明。</w:t>
             </w:r>
           </w:p>
         </w:tc>
@@ -1258,64 +1391,87 @@
           </w:tcPr>
           <w:p>
             <w:pPr>
+              <w:keepNext w:val="0"/>
               <w:spacing w:after="60" w:line="264" w:lineRule="auto"/>
             </w:pPr>
             <w:r>
-              <w:t>1. 保存边界：先同步 A 再写入未同步 B，强制结束后恢复 A；同步 B 后强制结束恢复 B；正常卸载后的修改可在重挂载后读取。</w:t>
+              <w:rPr>
+                <w:b w:val="0"/>
+                <w:color w:val="000000"/>
+              </w:rPr>
+              <w:t>1. 输入固定：实验开始成功后，修改、截断或删除当前文件不改变已固定内容；输入只读，普通快照删除不能误删实验版本。</w:t>
             </w:r>
           </w:p>
           <w:p>
             <w:pPr>
+              <w:keepNext w:val="0"/>
               <w:spacing w:after="60" w:line="264" w:lineRule="auto"/>
             </w:pPr>
             <w:r>
-              <w:t>2. 自动同步：开启后停止业务请求，未同步修改仍能保存；关闭时不自动提交。同步失败保留 dirty 与错误信息，修复后可重试成功。</w:t>
+              <w:rPr>
+                <w:b w:val="0"/>
+                <w:color w:val="000000"/>
+              </w:rPr>
+              <w:t>2. 事务失败：输入版本创建或保存失败时，不释放命令执行门，不留下半份快照；旧提交完整，恢复存储后能明确重试。</w:t>
             </w:r>
           </w:p>
           <w:p>
             <w:pPr>
+              <w:keepNext w:val="0"/>
               <w:spacing w:after="60" w:line="264" w:lineRule="auto"/>
             </w:pPr>
             <w:r>
-              <w:t>3. 事务失败：对 blobs、nodes、metadata 注入失败，并组合同步、创建快照、清理回收站共 9 组；旧提交完整，失败结果不对外生效。</w:t>
+              <w:rPr>
+                <w:b w:val="0"/>
+                <w:color w:val="000000"/>
+              </w:rPr>
+              <w:t>3. 中途留证：长实验先形成已保存的采集摘要，再强制结束 daemon；重启后保留固定输入及最后摘要，未知部分明确标记不完整。</w:t>
             </w:r>
           </w:p>
           <w:p>
             <w:pPr>
+              <w:keepNext w:val="0"/>
               <w:spacing w:after="60" w:line="264" w:lineRule="auto"/>
             </w:pPr>
             <w:r>
-              <w:t>4. 存储占用：短暂写锁释放后同步成功；超过等待时间则明确失败并保留修改，解除占用后重试能保存。</w:t>
+              <w:rPr>
+                <w:b w:val="0"/>
+                <w:color w:val="000000"/>
+              </w:rPr>
+              <w:t>4. 状态与恢复：成功、程序失败、取消、运行器中断和 daemon 崩溃有正确状态；不补造退出码或丢失的读取记录，不把中断当作完整实验。</w:t>
             </w:r>
           </w:p>
           <w:p>
             <w:pPr>
+              <w:keepNext w:val="0"/>
               <w:spacing w:after="60" w:line="264" w:lineRule="auto"/>
             </w:pPr>
             <w:r>
-              <w:t>5. 只读诊断：check 接受有效离线存储，拒绝正在使用、损坏或未知格式的存储且不重建数据；doctor 正确说明环境和挂载问题。</w:t>
+              <w:rPr>
+                <w:b w:val="0"/>
+                <w:color w:val="000000"/>
+              </w:rPr>
+              <w:t>5. 迁移与留存：报告和独立备份迁移后输入 SHA256 一致；损坏数据及已有导入目标不被覆盖；memory 模式明确说明输入不会跨重启保留。</w:t>
             </w:r>
           </w:p>
           <w:p>
             <w:pPr>
+              <w:keepNext w:val="0"/>
               <w:spacing w:after="60" w:line="264" w:lineRule="auto"/>
-            </w:pPr>
-            <w:r>
-              <w:t>6. 启动保护：同一存储的第二个挂载被拒绝，第一个挂载仍能正常使用；存储目录不能放在挂载点内。</w:t>
-            </w:r>
-          </w:p>
-          <w:p>
-            <w:pPr>
-              <w:spacing w:after="0" w:line="264" w:lineRule="auto"/>
             </w:pPr>
             <w:r>
               <w:rPr>
                 <w:b/>
+                <w:color w:val="000000"/>
               </w:rPr>
               <w:t>验收凭证：</w:t>
             </w:r>
             <w:r>
-              <w:t>保存前后内容校验、9 组故障日志、错误与重试记录、诊断输出、存储结构与保存时序图。</w:t>
+              <w:rPr>
+                <w:b w:val="0"/>
+                <w:color w:val="000000"/>
+              </w:rPr>
+              <w:t>快照与恢复 SHA256、事务失败与重试日志、中途保存文件、崩溃前后对照、备份校验与导入记录。</w:t>
             </w:r>
           </w:p>
         </w:tc>
@@ -1374,7 +1530,7 @@
                 <w:b w:val="0"/>
                 <w:color w:val="000000"/>
               </w:rPr>
-              <w:t>快照、回收站、恢复与备份</w:t>
+              <w:t>科研案例与输入输出证据</w:t>
             </w:r>
           </w:p>
         </w:tc>
@@ -1401,7 +1557,7 @@
                 <w:b w:val="0"/>
                 <w:color w:val="000000"/>
               </w:rPr>
-              <w:t>梳理当前文件与历史版本的关系；复核差异比较、单文件与目录恢复、覆盖保护、历史句柄和备份导入。</w:t>
+              <w:t>选择公开数据和多步骤分析流程；新增指定输出文件摘要、轻量环境信息及实验报告比较；组织同名输入变化和旧版本重放案例。</w:t>
             </w:r>
           </w:p>
         </w:tc>
@@ -1428,7 +1584,7 @@
                 <w:b w:val="0"/>
                 <w:color w:val="000000"/>
               </w:rPr>
-              <w:t>完整恢复案例、恢复前后内容校验、历史数据生命周期说明。</w:t>
+              <w:t>案例数据与程序、数据来源说明、输出摘要和报告比较功能、完整案例记录。</w:t>
             </w:r>
           </w:p>
         </w:tc>
@@ -1476,64 +1632,87 @@
           </w:tcPr>
           <w:p>
             <w:pPr>
+              <w:keepNext w:val="0"/>
               <w:spacing w:after="60" w:line="264" w:lineRule="auto"/>
             </w:pPr>
             <w:r>
-              <w:t>1. 历史隔离：创建快照后修改、截断、改名或删除当前文件，历史内容保持不变；对快照的写入、改名、删除和属性修改被拒绝。</w:t>
+              <w:rPr>
+                <w:b w:val="0"/>
+                <w:color w:val="000000"/>
+              </w:rPr>
+              <w:t>1. 案例可信：注明数据来源、规模和处理流程；包含数据、配置或辅助输入及未使用文件，人工核对实际依赖。合成数据须明确标注。</w:t>
             </w:r>
           </w:p>
           <w:p>
             <w:pPr>
+              <w:keepNext w:val="0"/>
               <w:spacing w:after="60" w:line="264" w:lineRule="auto"/>
             </w:pPr>
             <w:r>
-              <w:t>2. 恢复一致：中文名、二进制和空文件恢复后校验一致；目录恢复保持层级、权限和修改时间，软链接保持原目标字符串。</w:t>
+              <w:rPr>
+                <w:b w:val="0"/>
+                <w:color w:val="000000"/>
+              </w:rPr>
+              <w:t>2. 证据关联：通用报告包含输入与指定输出的路径、SHA256、命令、退出状态和轻量环境摘要；不把环境摘要当作完整环境归档。</w:t>
             </w:r>
           </w:p>
           <w:p>
             <w:pPr>
+              <w:keepNext w:val="0"/>
               <w:spacing w:after="60" w:line="264" w:lineRule="auto"/>
             </w:pPr>
             <w:r>
-              <w:t>3. 恢复边界：已有目标、缺失父目录、绝对路径、越界路径和管理目录目标均被拒绝，目标处不留下部分恢复内容。</w:t>
+              <w:rPr>
+                <w:b w:val="0"/>
+                <w:color w:val="000000"/>
+              </w:rPr>
+              <w:t>3. 报告比较：正确列出输入和输出的新增、删除与内容变化；PID、运行时间和实验名称变化不误判为文件正文变化。</w:t>
             </w:r>
           </w:p>
           <w:p>
             <w:pPr>
+              <w:keepNext w:val="0"/>
               <w:spacing w:after="60" w:line="264" w:lineRule="auto"/>
             </w:pPr>
             <w:r>
-              <w:t>4. 回收与句柄：普通删除、改名覆盖产生正确记录；恢复不移除原记录。清理记录或删除快照后，已打开的历史文件仍可读到关闭。</w:t>
+              <w:rPr>
+                <w:b w:val="0"/>
+                <w:color w:val="000000"/>
+              </w:rPr>
+              <w:t>4. 结果验证：修改同名数据或参数后结果确有变化；使用旧输入重放确定性案例，同环境输出逐字节及 SHA256 一致。</w:t>
             </w:r>
           </w:p>
           <w:p>
             <w:pPr>
+              <w:keepNext w:val="0"/>
               <w:spacing w:after="60" w:line="264" w:lineRule="auto"/>
             </w:pPr>
             <w:r>
-              <w:t>5. 差异正确：新增、删除、内容、属性、类型变化均正确列出；改名表现为旧路径删除和新路径新增，单纯读取不产生访问时间差异。</w:t>
+              <w:rPr>
+                <w:b w:val="0"/>
+                <w:color w:val="000000"/>
+              </w:rPr>
+              <w:t>5. 可移交使用：代码、数据和结果说明完整，组长及另一名成员能按步骤运行；成功与失败结果均有记录，说明可验证的结论和范围。</w:t>
             </w:r>
           </w:p>
           <w:p>
             <w:pPr>
+              <w:keepNext w:val="0"/>
               <w:spacing w:after="60" w:line="264" w:lineRule="auto"/>
-            </w:pPr>
-            <w:r>
-              <w:t>6. 独立备份：备份校验成功，导入新存储后文件与历史可读；损坏备份和已有目标被拒绝，不覆盖原存储或发布半成品。</w:t>
-            </w:r>
-          </w:p>
-          <w:p>
-            <w:pPr>
-              <w:spacing w:after="0" w:line="264" w:lineRule="auto"/>
             </w:pPr>
             <w:r>
               <w:rPr>
                 <w:b/>
+                <w:color w:val="000000"/>
               </w:rPr>
               <w:t>验收凭证：</w:t>
             </w:r>
             <w:r>
-              <w:t>完整恢复命令与录屏、恢复前后 SHA256、目录和属性对照、差异清单、备份校验及导入记录。</w:t>
+              <w:rPr>
+                <w:b w:val="0"/>
+                <w:color w:val="000000"/>
+              </w:rPr>
+              <w:t>数据来源与规模、案例代码、输入输出清单、原实验与改动后报告、比较结果、重放前后 SHA256 和运行步骤。</w:t>
             </w:r>
           </w:p>
         </w:tc>
@@ -1592,7 +1771,7 @@
                 <w:b w:val="0"/>
                 <w:color w:val="000000"/>
               </w:rPr>
-              <w:t>缓存、性能与资源分析</w:t>
+              <w:t>追溯开销与性能评估</w:t>
             </w:r>
           </w:p>
         </w:tc>
@@ -1619,7 +1798,7 @@
                 <w:b w:val="0"/>
                 <w:color w:val="000000"/>
               </w:rPr>
-              <w:t>理解按需读取、缓存和整文件版本保存；复现实测基线；补充 release 构建实验；分析锁等待、保存耗时及资源占用。</w:t>
+              <w:t>设计同一工作负载的三组对照；测量准备、运行、校验及报告耗时，内存和存储占用；分析分块与采集成本，提出并验证优化。</w:t>
             </w:r>
           </w:p>
         </w:tc>
@@ -1646,7 +1825,7 @@
                 <w:b w:val="0"/>
                 <w:color w:val="000000"/>
               </w:rPr>
-              <w:t>可复现性能报告、原始数据、瓶颈解释与有依据的优化建议。</w:t>
+              <w:t>可复现评估脚本、原始样本、性能图表、成本分析与优化前后记录。</w:t>
             </w:r>
           </w:p>
         </w:tc>
@@ -1694,56 +1873,87 @@
           </w:tcPr>
           <w:p>
             <w:pPr>
+              <w:keepNext w:val="0"/>
               <w:spacing w:after="60" w:line="264" w:lineRule="auto"/>
             </w:pPr>
             <w:r>
-              <w:t>1. 按需读取：保存并重挂载后记录内容读取量；读取文件片段结果正确，能够用指标说明内容何时加载及缓存、未落盘内容各自的占用。</w:t>
+              <w:rPr>
+                <w:b w:val="0"/>
+                <w:color w:val="000000"/>
+              </w:rPr>
+              <w:t>1. 公平对照：同一机器、数据和程序比较原生 Linux 目录、普通 TeamFS 与实验模式；每组至少 3 次，保存样本及中位数。</w:t>
             </w:r>
           </w:p>
           <w:p>
             <w:pPr>
+              <w:keepNext w:val="0"/>
               <w:spacing w:after="60" w:line="264" w:lineRule="auto"/>
             </w:pPr>
             <w:r>
-              <w:t>2. 基线复现：在相同机器、数据和参数下测试原生目录、direct、cached；每项至少 3 次，保存 fio 原始 JSON、样本及中位数。</w:t>
+              <w:rPr>
+                <w:b w:val="0"/>
+                <w:color w:val="000000"/>
+              </w:rPr>
+              <w:t>2. 分阶段计时：分别记录输入准备、程序运行、内容校验和报告导出，总耗时口径清楚；嵌套保存耗时不能重复相加。</w:t>
             </w:r>
           </w:p>
           <w:p>
             <w:pPr>
+              <w:keepNext w:val="0"/>
               <w:spacing w:after="60" w:line="264" w:lineRule="auto"/>
             </w:pPr>
             <w:r>
-              <w:t>3. 构建对照：补充 release 实验，明确实际可执行文件、编译参数和缓存条件；与 debug 对照，不混用两种构建的结果。</w:t>
+              <w:rPr>
+                <w:b w:val="0"/>
+                <w:color w:val="000000"/>
+              </w:rPr>
+              <w:t>3. 资源记录：说明实验进程和 daemon 的内存口径，记录数据库、WAL 与报告占用；内容插入字节不称为设备物理写入量。</w:t>
             </w:r>
           </w:p>
           <w:p>
             <w:pPr>
+              <w:keepNext w:val="0"/>
               <w:spacing w:after="60" w:line="264" w:lineRule="auto"/>
             </w:pPr>
             <w:r>
-              <w:t>4. 保存成本：分别修改 4KiB 文件和 16MiB 文件中的 4KiB，记录写入与同步耗时、SQL 内容插入量；正确解释当前整文件保存的成本。</w:t>
+              <w:rPr>
+                <w:b w:val="0"/>
+                <w:color w:val="000000"/>
+              </w:rPr>
+              <w:t>4. 条件可复现：注明提交号、构建、缓存及日志设置，覆盖小文件、多文件和较大输入；debug 与 release 分开，不清缓存不能称严格冷读。</w:t>
             </w:r>
           </w:p>
           <w:p>
             <w:pPr>
+              <w:keepNext w:val="0"/>
               <w:spacing w:after="60" w:line="264" w:lineRule="auto"/>
             </w:pPr>
             <w:r>
-              <w:t>5. 慢请求分析：复现一次短暂存储等待，指标能定位保存阶段，解除后正常保存；区分锁等待、业务处理和其中的保存耗时，避免重复累计。</w:t>
+              <w:rPr>
+                <w:b w:val="0"/>
+                <w:color w:val="000000"/>
+              </w:rPr>
+              <w:t>5. 结论有依据：优化有前后样本且回归通过；如追溯更慢则如实说明代价，不预设快于原生目录，不外推到未测的生产规模。</w:t>
             </w:r>
           </w:p>
           <w:p>
             <w:pPr>
+              <w:keepNext w:val="0"/>
               <w:spacing w:after="0" w:line="264" w:lineRule="auto"/>
             </w:pPr>
             <w:r>
               <w:rPr>
                 <w:b/>
+                <w:color w:val="000000"/>
               </w:rPr>
               <w:t>验收凭证：</w:t>
             </w:r>
             <w:r>
-              <w:t>环境、版本、构建与命令记录，原始样本、对照报告和瓶颈解释；优化建议须有测量依据，不预设必须快于原生文件系统。</w:t>
+              <w:rPr>
+                <w:b w:val="0"/>
+                <w:color w:val="000000"/>
+              </w:rPr>
+              <w:t>机器与构建信息、命令和原始 JSON 或 CSV、阶段耗时与资源统计、对照图表、优化及回归记录。</w:t>
             </w:r>
           </w:p>
         </w:tc>
@@ -1802,7 +2012,7 @@
                 <w:b w:val="0"/>
                 <w:color w:val="000000"/>
               </w:rPr>
-              <w:t>操作日志、真实监控与展示体验</w:t>
+              <w:t>实验报告页面与展示体验</w:t>
             </w:r>
           </w:p>
         </w:tc>
@@ -1829,7 +2039,7 @@
                 <w:b w:val="0"/>
                 <w:color w:val="000000"/>
               </w:rPr>
-              <w:t>理解日志从回调到 JSON、HTTP 和页面的过程；复核筛选、耗时详情、断线提示及日志故障隔离；完善演示页面说明。</w:t>
+              <w:t>新增实验列表、报告详情和输入输出差异展示；对接真实报告及挂载状态；复核只读监控，更新离线讲解、版本和演示入口。</w:t>
             </w:r>
           </w:p>
         </w:tc>
@@ -1856,7 +2066,7 @@
                 <w:b w:val="0"/>
                 <w:color w:val="000000"/>
               </w:rPr>
-              <w:t>监控流程图、真实操作录屏、监控验收记录、统一后的展示页面。</w:t>
+              <w:t>实验报告页面、真实数据对接、界面验收与录屏、统一后的展示入口。</w:t>
             </w:r>
           </w:p>
         </w:tc>
@@ -1904,64 +2114,87 @@
           </w:tcPr>
           <w:p>
             <w:pPr>
+              <w:keepNext w:val="0"/>
               <w:spacing w:after="60" w:line="264" w:lineRule="auto"/>
             </w:pPr>
             <w:r>
-              <w:t>1. 真实对应：在挂载点执行创建、读写、改名、删除和同步；日志中的操作、路径、PID、结果及实际字节与对应回调一致，不包含文件正文。</w:t>
+              <w:rPr>
+                <w:b w:val="0"/>
+                <w:color w:val="000000"/>
+              </w:rPr>
+              <w:t>1. 数据真实：列表与详情来自实际报告，显示实验名称、状态、命令、退出结果及输入输出；成功、失败和取消不混为同一状态。</w:t>
             </w:r>
           </w:p>
           <w:p>
             <w:pPr>
+              <w:keepNext w:val="0"/>
               <w:spacing w:after="60" w:line="264" w:lineRule="auto"/>
             </w:pPr>
             <w:r>
-              <w:t>2. 查询与筛选：路径、操作、结果、PID、最小耗时筛选正确；详情显示时间分解，导出的 JSON 只包含当前筛选结果。</w:t>
+              <w:rPr>
+                <w:b w:val="0"/>
+                <w:color w:val="000000"/>
+              </w:rPr>
+              <w:t>2. 输入分类：正文、仅打开和元数据访问有清楚区分；中文与特殊名称显示不混淆，未固定输入、越界链接和不完整采集有提示。</w:t>
             </w:r>
           </w:p>
           <w:p>
             <w:pPr>
+              <w:keepNext w:val="0"/>
               <w:spacing w:after="60" w:line="264" w:lineRule="auto"/>
             </w:pPr>
             <w:r>
-              <w:t>3. 统计口径：多次读取状态、日志和指标文件不增加业务读写计数或制造日志循环；能够解释内核缓存及内核提前拒绝请求的统计边界。</w:t>
+              <w:rPr>
+                <w:b w:val="0"/>
+                <w:color w:val="000000"/>
+              </w:rPr>
+              <w:t>3. 差异对应：两次报告的输入输出变化与成员 4 的比较结果一致；能展示同名输入改变，以及旧版本重放后的结果一致性。</w:t>
             </w:r>
           </w:p>
           <w:p>
             <w:pPr>
+              <w:keepNext w:val="0"/>
               <w:spacing w:after="60" w:line="264" w:lineRule="auto"/>
             </w:pPr>
             <w:r>
-              <w:t>4. 固定读取：同一句柄分段读取状态、日志和指标 JSON 可完整解析且内容固定；重新打开后能看到新操作。</w:t>
+              <w:rPr>
+                <w:b w:val="0"/>
+                <w:color w:val="000000"/>
+              </w:rPr>
+              <w:t>4. 异常与只读：缺失或损坏报告、断线及重挂载有明确状态，旧数据显示采样时间；页面查看不修改文件、不触发同步或实验运行。</w:t>
             </w:r>
           </w:p>
           <w:p>
             <w:pPr>
+              <w:keepNext w:val="0"/>
               <w:spacing w:after="60" w:line="264" w:lineRule="auto"/>
             </w:pPr>
             <w:r>
-              <w:t>5. 连接状态：暂停后保持旧采样，恢复后继续更新；断开时明确显示旧数据及最后采样时间，重挂载后识别新会话。</w:t>
+              <w:rPr>
+                <w:b w:val="0"/>
+                <w:color w:val="000000"/>
+              </w:rPr>
+              <w:t>5. 交付一致：页面、README 和实际版本及命令入口一致，模拟与真实展示明确区分；另一名成员可按说明启动并查看科研案例。</w:t>
             </w:r>
           </w:p>
           <w:p>
             <w:pPr>
+              <w:keepNext w:val="0"/>
               <w:spacing w:after="60" w:line="264" w:lineRule="auto"/>
-            </w:pPr>
-            <w:r>
-              <w:t>6. 日志故障：在独立测试目录模拟日志不可写，业务写入与同步仍成功；页面或状态显示日志错误和丢失量，修复后恢复记录。</w:t>
-            </w:r>
-          </w:p>
-          <w:p>
-            <w:pPr>
-              <w:spacing w:after="0" w:line="264" w:lineRule="auto"/>
             </w:pPr>
             <w:r>
               <w:rPr>
                 <w:b/>
+                <w:color w:val="000000"/>
               </w:rPr>
               <w:t>验收凭证：</w:t>
             </w:r>
             <w:r>
-              <w:t>真实事件样本、筛选导出 JSON、时间分解截图、断线与恢复录屏、日志故障隔离记录。</w:t>
+              <w:rPr>
+                <w:b w:val="0"/>
+                <w:color w:val="000000"/>
+              </w:rPr>
+              <w:t>真实报告与界面对照、差异截图、失败及断线录屏、只读验收记录、启动说明和完整展示录屏。</w:t>
             </w:r>
           </w:p>
         </w:tc>

</xml_diff>